<commit_message>
added the heuristic calculation
</commit_message>
<xml_diff>
--- a/HW2_IntroToAI.docx
+++ b/HW2_IntroToAI.docx
@@ -5458,21 +5458,41 @@
         <w:spacing w:after="0" w:line="276" w:lineRule="auto"/>
         <w:jc w:val="left"/>
         <w:rPr>
+          <w:rFonts w:asciiTheme="majorHAnsi" w:eastAsia="Assistant" w:hAnsiTheme="majorHAnsi" w:cstheme="minorBidi"/>
+          <w:color w:val="0070C0"/>
+          <w:sz w:val="26"/>
+          <w:szCs w:val="26"/>
+          <w:rtl/>
+        </w:rPr>
+      </w:pPr>
+      <w:r>
+        <w:rPr>
+          <w:rFonts w:asciiTheme="majorHAnsi" w:eastAsia="Assistant" w:hAnsiTheme="majorHAnsi" w:cstheme="minorBidi"/>
+          <w:color w:val="0070C0"/>
+          <w:sz w:val="26"/>
+          <w:szCs w:val="26"/>
+        </w:rPr>
+        <w:t>G</w:t>
+      </w:r>
+      <w:r>
+        <w:rPr>
           <w:rFonts w:asciiTheme="majorHAnsi" w:eastAsia="Assistant" w:hAnsiTheme="majorHAnsi" w:cstheme="minorBidi" w:hint="cs"/>
           <w:color w:val="0070C0"/>
           <w:sz w:val="26"/>
           <w:szCs w:val="26"/>
           <w:rtl/>
         </w:rPr>
-      </w:pPr>
+        <w:t xml:space="preserve"> </w:t>
+      </w:r>
       <w:r>
         <w:rPr>
           <w:rFonts w:asciiTheme="majorHAnsi" w:eastAsia="Assistant" w:hAnsiTheme="majorHAnsi" w:cstheme="minorBidi"/>
           <w:color w:val="0070C0"/>
           <w:sz w:val="26"/>
           <w:szCs w:val="26"/>
-        </w:rPr>
-        <w:t>G</w:t>
+          <w:rtl/>
+        </w:rPr>
+        <w:t>–</w:t>
       </w:r>
       <w:r>
         <w:rPr>
@@ -5482,7 +5502,7 @@
           <w:szCs w:val="26"/>
           <w:rtl/>
         </w:rPr>
-        <w:t xml:space="preserve"> </w:t>
+        <w:t xml:space="preserve"> מצב סופי של המשחק </w:t>
       </w:r>
       <w:r>
         <w:rPr>
@@ -5502,26 +5522,6 @@
           <w:szCs w:val="26"/>
           <w:rtl/>
         </w:rPr>
-        <w:t xml:space="preserve"> מצב סופי של המשחק </w:t>
-      </w:r>
-      <w:r>
-        <w:rPr>
-          <w:rFonts w:asciiTheme="majorHAnsi" w:eastAsia="Assistant" w:hAnsiTheme="majorHAnsi" w:cstheme="minorBidi"/>
-          <w:color w:val="0070C0"/>
-          <w:sz w:val="26"/>
-          <w:szCs w:val="26"/>
-          <w:rtl/>
-        </w:rPr>
-        <w:t>–</w:t>
-      </w:r>
-      <w:r>
-        <w:rPr>
-          <w:rFonts w:asciiTheme="majorHAnsi" w:eastAsia="Assistant" w:hAnsiTheme="majorHAnsi" w:cstheme="minorBidi" w:hint="cs"/>
-          <w:color w:val="0070C0"/>
-          <w:sz w:val="26"/>
-          <w:szCs w:val="26"/>
-          <w:rtl/>
-        </w:rPr>
         <w:t xml:space="preserve"> מצבים בהם לרובוטים אין סוללה, או שנגמרו הצעדים הנותרים, המנצח הוא הרובוט עם היותר קרדיטים.</w:t>
       </w:r>
     </w:p>
@@ -5531,7 +5531,7 @@
         <w:spacing w:after="0" w:line="276" w:lineRule="auto"/>
         <w:jc w:val="left"/>
         <w:rPr>
-          <w:rFonts w:asciiTheme="majorHAnsi" w:eastAsia="Assistant" w:hAnsiTheme="majorHAnsi" w:cstheme="minorBidi" w:hint="cs"/>
+          <w:rFonts w:asciiTheme="majorHAnsi" w:eastAsia="Assistant" w:hAnsiTheme="majorHAnsi" w:cstheme="minorBidi"/>
           <w:color w:val="0070C0"/>
           <w:sz w:val="26"/>
           <w:szCs w:val="26"/>
@@ -5610,6 +5610,1910 @@
     </w:p>
     <w:p>
       <w:pPr>
+        <w:spacing w:after="464" w:line="291" w:lineRule="auto"/>
+        <w:ind w:right="166"/>
+        <w:jc w:val="left"/>
+        <w:rPr>
+          <w:color w:val="0070C0"/>
+          <w:rtl/>
+        </w:rPr>
+      </w:pPr>
+      <w:r>
+        <w:rPr>
+          <w:rFonts w:hint="cs"/>
+          <w:color w:val="0070C0"/>
+          <w:rtl/>
+        </w:rPr>
+        <w:t xml:space="preserve">נגדיר את ההיוריסטיקה </w:t>
+      </w:r>
+      <m:oMath>
+        <m:r>
+          <w:rPr>
+            <w:rFonts w:ascii="Cambria Math" w:hAnsi="Cambria Math"/>
+            <w:color w:val="0070C0"/>
+          </w:rPr>
+          <m:t>h(s,r)</m:t>
+        </m:r>
+      </m:oMath>
+      <w:r>
+        <w:rPr>
+          <w:rFonts w:hint="cs"/>
+          <w:color w:val="0070C0"/>
+          <w:rtl/>
+        </w:rPr>
+        <w:t xml:space="preserve">, שמעריכה את מצב </w:t>
+      </w:r>
+      <w:r>
+        <w:rPr>
+          <w:color w:val="0070C0"/>
+        </w:rPr>
+        <w:t>s</w:t>
+      </w:r>
+      <w:r>
+        <w:rPr>
+          <w:rFonts w:hint="cs"/>
+          <w:color w:val="0070C0"/>
+          <w:rtl/>
+        </w:rPr>
+        <w:t xml:space="preserve"> עבור רובוט </w:t>
+      </w:r>
+      <w:r>
+        <w:rPr>
+          <w:color w:val="0070C0"/>
+        </w:rPr>
+        <w:t>r</w:t>
+      </w:r>
+      <w:r>
+        <w:rPr>
+          <w:rFonts w:hint="cs"/>
+          <w:color w:val="0070C0"/>
+          <w:rtl/>
+        </w:rPr>
+        <w:t>:</w:t>
+      </w:r>
+    </w:p>
+    <w:p>
+      <w:pPr>
+        <w:spacing w:after="464" w:line="291" w:lineRule="auto"/>
+        <w:ind w:right="166"/>
+        <w:jc w:val="left"/>
+        <w:rPr>
+          <w:color w:val="0070C0"/>
+        </w:rPr>
+      </w:pPr>
+      <m:oMathPara>
+        <m:oMath>
+          <m:r>
+            <w:rPr>
+              <w:rFonts w:ascii="Cambria Math" w:hAnsi="Cambria Math"/>
+              <w:color w:val="0070C0"/>
+            </w:rPr>
+            <m:t>h(s,r)=0.5⋅ScoreDiff(s,r)+3⋅PackageUtility(s,r)-4⋅EnergyRisk(s,r)</m:t>
+          </m:r>
+        </m:oMath>
+      </m:oMathPara>
+    </w:p>
+    <w:p>
+      <w:pPr>
+        <w:spacing w:after="464" w:line="291" w:lineRule="auto"/>
+        <w:ind w:right="166"/>
+        <w:jc w:val="left"/>
+        <w:rPr>
+          <w:rFonts w:ascii="Cambria Math" w:hAnsi="Cambria Math"/>
+          <w:i/>
+          <w:color w:val="0070C0"/>
+          <w:rtl/>
+        </w:rPr>
+      </w:pPr>
+      <w:r>
+        <w:rPr>
+          <w:rFonts w:ascii="Cambria Math" w:hAnsi="Cambria Math"/>
+          <w:iCs/>
+          <w:color w:val="0070C0"/>
+        </w:rPr>
+        <w:t>o</w:t>
+      </w:r>
+      <w:r>
+        <w:rPr>
+          <w:rFonts w:ascii="Cambria Math" w:hAnsi="Cambria Math"/>
+          <w:iCs/>
+          <w:color w:val="0070C0"/>
+        </w:rPr>
+        <w:t>pponent</w:t>
+      </w:r>
+      <w:r>
+        <w:rPr>
+          <w:rFonts w:ascii="Cambria Math" w:hAnsi="Cambria Math" w:hint="cs"/>
+          <w:i/>
+          <w:color w:val="0070C0"/>
+          <w:rtl/>
+        </w:rPr>
+        <w:t xml:space="preserve"> </w:t>
+      </w:r>
+      <w:r>
+        <w:rPr>
+          <w:rFonts w:ascii="Cambria Math" w:hAnsi="Cambria Math"/>
+          <w:i/>
+          <w:color w:val="0070C0"/>
+          <w:rtl/>
+        </w:rPr>
+        <w:t>–</w:t>
+      </w:r>
+      <w:r>
+        <w:rPr>
+          <w:rFonts w:ascii="Cambria Math" w:hAnsi="Cambria Math" w:hint="cs"/>
+          <w:i/>
+          <w:color w:val="0070C0"/>
+          <w:rtl/>
+        </w:rPr>
+        <w:t xml:space="preserve"> </w:t>
+      </w:r>
+      <w:r>
+        <w:rPr>
+          <w:rFonts w:ascii="Cambria Math" w:hAnsi="Cambria Math" w:hint="cs"/>
+          <w:i/>
+          <w:color w:val="0070C0"/>
+          <w:rtl/>
+        </w:rPr>
+        <w:t>הרובוט המתחרה</w:t>
+      </w:r>
+      <w:r>
+        <w:rPr>
+          <w:rFonts w:ascii="Cambria Math" w:hAnsi="Cambria Math"/>
+          <w:i/>
+          <w:color w:val="0070C0"/>
+        </w:rPr>
+        <w:br/>
+      </w:r>
+      <m:oMathPara>
+        <m:oMath>
+          <m:r>
+            <w:rPr>
+              <w:rFonts w:ascii="Cambria Math" w:hAnsi="Cambria Math"/>
+              <w:color w:val="0070C0"/>
+            </w:rPr>
+            <m:t>ScoreDiff(s,r)=credit(r)-credit(</m:t>
+          </m:r>
+          <m:r>
+            <m:rPr>
+              <m:sty m:val="p"/>
+            </m:rPr>
+            <w:rPr>
+              <w:rFonts w:ascii="Cambria Math" w:hAnsi="Cambria Math"/>
+              <w:color w:val="0070C0"/>
+            </w:rPr>
+            <m:t>opponent</m:t>
+          </m:r>
+          <m:r>
+            <w:rPr>
+              <w:rFonts w:ascii="Cambria Math" w:hAnsi="Cambria Math" w:hint="cs"/>
+              <w:color w:val="0070C0"/>
+              <w:rtl/>
+            </w:rPr>
+            <m:t xml:space="preserve"> </m:t>
+          </m:r>
+          <m:r>
+            <w:rPr>
+              <w:rFonts w:ascii="Cambria Math" w:hAnsi="Cambria Math"/>
+              <w:color w:val="0070C0"/>
+            </w:rPr>
+            <m:t>)</m:t>
+          </m:r>
+        </m:oMath>
+      </m:oMathPara>
+    </w:p>
+    <w:p>
+      <w:pPr>
+        <w:spacing w:after="464" w:line="291" w:lineRule="auto"/>
+        <w:ind w:right="166"/>
+        <w:jc w:val="left"/>
+        <w:rPr>
+          <w:rFonts w:ascii="Cambria Math" w:hAnsi="Cambria Math"/>
+          <w:i/>
+          <w:color w:val="0070C0"/>
+          <w:rtl/>
+        </w:rPr>
+      </w:pPr>
+      <w:r>
+        <w:rPr>
+          <w:rFonts w:ascii="Cambria Math" w:hAnsi="Cambria Math" w:hint="cs"/>
+          <w:i/>
+          <w:color w:val="0070C0"/>
+          <w:rtl/>
+        </w:rPr>
+        <w:t>זה מייצג את ההבדל בניקוד הנוכחי</w:t>
+      </w:r>
+      <w:r>
+        <w:rPr>
+          <w:rFonts w:ascii="Cambria Math" w:hAnsi="Cambria Math" w:hint="cs"/>
+          <w:i/>
+          <w:color w:val="0070C0"/>
+          <w:rtl/>
+        </w:rPr>
+        <w:t xml:space="preserve"> </w:t>
+      </w:r>
+      <w:r>
+        <w:rPr>
+          <w:rFonts w:ascii="Cambria Math" w:hAnsi="Cambria Math"/>
+          <w:i/>
+          <w:color w:val="0070C0"/>
+          <w:rtl/>
+        </w:rPr>
+        <w:t>–</w:t>
+      </w:r>
+      <w:r>
+        <w:rPr>
+          <w:rFonts w:ascii="Cambria Math" w:hAnsi="Cambria Math" w:hint="cs"/>
+          <w:i/>
+          <w:color w:val="0070C0"/>
+          <w:rtl/>
+        </w:rPr>
+        <w:t xml:space="preserve"> משפיע בעיקר אחרי הורדת חבילה כשערך הניקוד </w:t>
+      </w:r>
+      <w:r>
+        <w:rPr>
+          <w:rFonts w:ascii="Cambria Math" w:hAnsi="Cambria Math" w:hint="cs"/>
+          <w:i/>
+          <w:color w:val="0070C0"/>
+          <w:rtl/>
+        </w:rPr>
+        <w:t>עולה, או בזמן טעינה כשהניקוד מומר לסוללה.</w:t>
+      </w:r>
+    </w:p>
+    <w:p>
+      <w:pPr>
+        <w:spacing w:after="464" w:line="291" w:lineRule="auto"/>
+        <w:ind w:right="166"/>
+        <w:jc w:val="left"/>
+        <w:rPr>
+          <w:rFonts w:ascii="Cambria Math" w:hAnsi="Cambria Math"/>
+          <w:i/>
+          <w:color w:val="0070C0"/>
+          <w:rtl/>
+        </w:rPr>
+      </w:pPr>
+      <w:r>
+        <w:rPr>
+          <w:rFonts w:ascii="Cambria Math" w:hAnsi="Cambria Math" w:hint="cs"/>
+          <w:i/>
+          <w:color w:val="0070C0"/>
+          <w:rtl/>
+        </w:rPr>
+        <w:t xml:space="preserve">לכל חבילה </w:t>
+      </w:r>
+      <w:r>
+        <w:rPr>
+          <w:rFonts w:ascii="Cambria Math" w:hAnsi="Cambria Math"/>
+          <w:iCs/>
+          <w:color w:val="0070C0"/>
+        </w:rPr>
+        <w:t>p</w:t>
+      </w:r>
+      <w:r>
+        <w:rPr>
+          <w:rFonts w:ascii="Cambria Math" w:hAnsi="Cambria Math" w:hint="cs"/>
+          <w:iCs/>
+          <w:color w:val="0070C0"/>
+          <w:rtl/>
+        </w:rPr>
+        <w:t xml:space="preserve"> </w:t>
+      </w:r>
+      <w:r>
+        <w:rPr>
+          <w:rFonts w:ascii="Cambria Math" w:hAnsi="Cambria Math" w:hint="cs"/>
+          <w:i/>
+          <w:color w:val="0070C0"/>
+          <w:rtl/>
+        </w:rPr>
+        <w:t>נגדיר:</w:t>
+      </w:r>
+    </w:p>
+    <w:p>
+      <w:pPr>
+        <w:spacing w:after="464" w:line="291" w:lineRule="auto"/>
+        <w:ind w:right="166"/>
+        <w:jc w:val="left"/>
+        <w:rPr>
+          <w:rFonts w:ascii="Cambria Math" w:hAnsi="Cambria Math" w:hint="cs"/>
+          <w:i/>
+          <w:color w:val="0070C0"/>
+          <w:rtl/>
+        </w:rPr>
+      </w:pPr>
+      <m:oMathPara>
+        <m:oMath>
+          <m:r>
+            <w:rPr>
+              <w:rFonts w:ascii="Cambria Math" w:hAnsi="Cambria Math"/>
+              <w:color w:val="0070C0"/>
+            </w:rPr>
+            <m:t>Reward(p)=3⋅Manhattan(origin(p),destination(p))</m:t>
+          </m:r>
+        </m:oMath>
+      </m:oMathPara>
+    </w:p>
+    <w:p>
+      <w:pPr>
+        <w:spacing w:after="464" w:line="291" w:lineRule="auto"/>
+        <w:ind w:right="166"/>
+        <w:jc w:val="left"/>
+        <w:rPr>
+          <w:color w:val="0070C0"/>
+        </w:rPr>
+      </w:pPr>
+      <w:r>
+        <w:rPr>
+          <w:rFonts w:hint="cs"/>
+          <w:color w:val="0070C0"/>
+          <w:rtl/>
+        </w:rPr>
+        <w:t xml:space="preserve">אסמן </w:t>
+      </w:r>
+      <w:r>
+        <w:rPr>
+          <w:color w:val="0070C0"/>
+        </w:rPr>
+        <w:t>p</w:t>
+      </w:r>
+      <w:r>
+        <w:rPr>
+          <w:color w:val="0070C0"/>
+        </w:rPr>
+        <w:t>*</w:t>
+      </w:r>
+      <w:r>
+        <w:rPr>
+          <w:rFonts w:hint="cs"/>
+          <w:color w:val="0070C0"/>
+          <w:rtl/>
+        </w:rPr>
+        <w:t xml:space="preserve"> </w:t>
+      </w:r>
+      <w:r>
+        <w:rPr>
+          <w:rFonts w:hint="cs"/>
+          <w:color w:val="0070C0"/>
+          <w:rtl/>
+        </w:rPr>
+        <w:t xml:space="preserve">את החבילה שרובוט </w:t>
+      </w:r>
+      <w:r>
+        <w:rPr>
+          <w:color w:val="0070C0"/>
+        </w:rPr>
+        <w:t>r</w:t>
+      </w:r>
+      <w:r>
+        <w:rPr>
+          <w:rFonts w:hint="cs"/>
+          <w:color w:val="0070C0"/>
+          <w:rtl/>
+        </w:rPr>
+        <w:t xml:space="preserve"> סוחב כרגע. אם אינו סוחב חבילה כרגע, אז</w:t>
+      </w:r>
+      <w:r>
+        <w:rPr>
+          <w:rFonts w:hint="cs"/>
+          <w:color w:val="0070C0"/>
+          <w:rtl/>
+        </w:rPr>
+        <w:t xml:space="preserve"> אגדיר את </w:t>
+      </w:r>
+      <w:r>
+        <w:rPr>
+          <w:color w:val="0070C0"/>
+        </w:rPr>
+        <w:t>p</w:t>
+      </w:r>
+      <w:r>
+        <w:rPr>
+          <w:color w:val="0070C0"/>
+        </w:rPr>
+        <w:t>*</w:t>
+      </w:r>
+      <w:r>
+        <w:rPr>
+          <w:rFonts w:hint="cs"/>
+          <w:color w:val="0070C0"/>
+          <w:rtl/>
+        </w:rPr>
+        <w:t xml:space="preserve"> כך</w:t>
+      </w:r>
+      <w:r>
+        <w:rPr>
+          <w:rFonts w:hint="cs"/>
+          <w:color w:val="0070C0"/>
+          <w:rtl/>
+        </w:rPr>
+        <w:t xml:space="preserve"> </w:t>
+      </w:r>
+      <w:r>
+        <w:rPr>
+          <w:color w:val="0070C0"/>
+        </w:rPr>
+        <w:t>:</w:t>
+      </w:r>
+    </w:p>
+    <w:p>
+      <w:pPr>
+        <w:spacing w:after="464" w:line="291" w:lineRule="auto"/>
+        <w:ind w:right="166"/>
+        <w:jc w:val="left"/>
+        <w:rPr>
+          <w:color w:val="0070C0"/>
+        </w:rPr>
+      </w:pPr>
+    </w:p>
+    <w:p>
+      <w:pPr>
+        <w:spacing w:after="464" w:line="291" w:lineRule="auto"/>
+        <w:ind w:right="166"/>
+        <w:jc w:val="left"/>
+        <w:rPr>
+          <w:rFonts w:ascii="Cambria Math" w:hAnsi="Cambria Math"/>
+          <w:i/>
+          <w:color w:val="0070C0"/>
+          <w:rtl/>
+        </w:rPr>
+      </w:pPr>
+      <m:oMathPara>
+        <m:oMath>
+          <m:r>
+            <w:rPr>
+              <w:rFonts w:ascii="Cambria Math" w:hAnsi="Cambria Math"/>
+              <w:color w:val="0070C0"/>
+            </w:rPr>
+            <m:t>PackageCandidate</m:t>
+          </m:r>
+          <m:d>
+            <m:dPr>
+              <m:ctrlPr>
+                <w:rPr>
+                  <w:rFonts w:ascii="Cambria Math" w:hAnsi="Cambria Math"/>
+                  <w:i/>
+                  <w:color w:val="0070C0"/>
+                </w:rPr>
+              </m:ctrlPr>
+            </m:dPr>
+            <m:e>
+              <m:r>
+                <w:rPr>
+                  <w:rFonts w:ascii="Cambria Math" w:hAnsi="Cambria Math"/>
+                  <w:color w:val="0070C0"/>
+                </w:rPr>
+                <m:t>s,r,p</m:t>
+              </m:r>
+            </m:e>
+          </m:d>
+          <m:r>
+            <w:rPr>
+              <w:rFonts w:ascii="Cambria Math" w:hAnsi="Cambria Math"/>
+              <w:color w:val="0070C0"/>
+            </w:rPr>
+            <m:t>=</m:t>
+          </m:r>
+          <m:r>
+            <w:rPr>
+              <w:rFonts w:ascii="Cambria Math" w:hAnsi="Cambria Math"/>
+              <w:color w:val="0070C0"/>
+            </w:rPr>
+            <m:t>=</m:t>
+          </m:r>
+          <m:r>
+            <w:rPr>
+              <w:rFonts w:ascii="Cambria Math" w:hAnsi="Cambria Math"/>
+              <w:color w:val="0070C0"/>
+            </w:rPr>
+            <m:t>Reward</m:t>
+          </m:r>
+          <m:d>
+            <m:dPr>
+              <m:ctrlPr>
+                <w:rPr>
+                  <w:rFonts w:ascii="Cambria Math" w:hAnsi="Cambria Math"/>
+                  <w:i/>
+                  <w:color w:val="0070C0"/>
+                </w:rPr>
+              </m:ctrlPr>
+            </m:dPr>
+            <m:e>
+              <m:r>
+                <w:rPr>
+                  <w:rFonts w:ascii="Cambria Math" w:hAnsi="Cambria Math"/>
+                  <w:color w:val="0070C0"/>
+                </w:rPr>
+                <m:t>p</m:t>
+              </m:r>
+            </m:e>
+          </m:d>
+          <m:r>
+            <w:rPr>
+              <w:rFonts w:ascii="Cambria Math" w:hAnsi="Cambria Math"/>
+              <w:color w:val="0070C0"/>
+            </w:rPr>
+            <m:t>-Manhattan</m:t>
+          </m:r>
+          <m:d>
+            <m:dPr>
+              <m:ctrlPr>
+                <w:rPr>
+                  <w:rFonts w:ascii="Cambria Math" w:hAnsi="Cambria Math"/>
+                  <w:i/>
+                  <w:color w:val="0070C0"/>
+                </w:rPr>
+              </m:ctrlPr>
+            </m:dPr>
+            <m:e>
+              <m:r>
+                <w:rPr>
+                  <w:rFonts w:ascii="Cambria Math" w:hAnsi="Cambria Math"/>
+                  <w:color w:val="0070C0"/>
+                </w:rPr>
+                <m:t>position</m:t>
+              </m:r>
+              <m:d>
+                <m:dPr>
+                  <m:ctrlPr>
+                    <w:rPr>
+                      <w:rFonts w:ascii="Cambria Math" w:hAnsi="Cambria Math"/>
+                      <w:i/>
+                      <w:color w:val="0070C0"/>
+                    </w:rPr>
+                  </m:ctrlPr>
+                </m:dPr>
+                <m:e>
+                  <m:r>
+                    <w:rPr>
+                      <w:rFonts w:ascii="Cambria Math" w:hAnsi="Cambria Math"/>
+                      <w:color w:val="0070C0"/>
+                    </w:rPr>
+                    <m:t>r</m:t>
+                  </m:r>
+                </m:e>
+              </m:d>
+              <m:r>
+                <w:rPr>
+                  <w:rFonts w:ascii="Cambria Math" w:hAnsi="Cambria Math"/>
+                  <w:color w:val="0070C0"/>
+                </w:rPr>
+                <m:t>,position</m:t>
+              </m:r>
+              <m:d>
+                <m:dPr>
+                  <m:ctrlPr>
+                    <w:rPr>
+                      <w:rFonts w:ascii="Cambria Math" w:hAnsi="Cambria Math"/>
+                      <w:i/>
+                      <w:color w:val="0070C0"/>
+                    </w:rPr>
+                  </m:ctrlPr>
+                </m:dPr>
+                <m:e>
+                  <m:r>
+                    <w:rPr>
+                      <w:rFonts w:ascii="Cambria Math" w:hAnsi="Cambria Math"/>
+                      <w:color w:val="0070C0"/>
+                    </w:rPr>
+                    <m:t>p</m:t>
+                  </m:r>
+                </m:e>
+              </m:d>
+            </m:e>
+          </m:d>
+          <m:r>
+            <w:rPr>
+              <w:rFonts w:ascii="Cambria Math" w:hAnsi="Cambria Math"/>
+              <w:color w:val="0070C0"/>
+            </w:rPr>
+            <m:t>-Manhattan(position(p),destination(p))</m:t>
+          </m:r>
+        </m:oMath>
+      </m:oMathPara>
+    </w:p>
+    <w:p>
+      <w:pPr>
+        <w:spacing w:after="464" w:line="291" w:lineRule="auto"/>
+        <w:ind w:right="166"/>
+        <w:jc w:val="left"/>
+        <w:rPr>
+          <w:rFonts w:ascii="Cambria Math" w:hAnsi="Cambria Math"/>
+          <w:i/>
+          <w:color w:val="0070C0"/>
+        </w:rPr>
+      </w:pPr>
+      <m:oMathPara>
+        <m:oMath>
+          <m:sSup>
+            <m:sSupPr>
+              <m:ctrlPr>
+                <w:rPr>
+                  <w:rFonts w:ascii="Cambria Math" w:hAnsi="Cambria Math"/>
+                  <w:i/>
+                  <w:color w:val="0070C0"/>
+                </w:rPr>
+              </m:ctrlPr>
+            </m:sSupPr>
+            <m:e>
+              <m:r>
+                <w:rPr>
+                  <w:rFonts w:ascii="Cambria Math" w:hAnsi="Cambria Math"/>
+                  <w:color w:val="0070C0"/>
+                </w:rPr>
+                <m:t>p</m:t>
+              </m:r>
+            </m:e>
+            <m:sup>
+              <m:r>
+                <w:rPr>
+                  <w:rFonts w:ascii="Cambria Math" w:hAnsi="Cambria Math"/>
+                  <w:color w:val="0070C0"/>
+                </w:rPr>
+                <m:t>*</m:t>
+              </m:r>
+            </m:sup>
+          </m:sSup>
+          <m:r>
+            <w:rPr>
+              <w:rFonts w:ascii="Cambria Math" w:hAnsi="Cambria Math"/>
+              <w:color w:val="0070C0"/>
+            </w:rPr>
+            <m:t>=arg⁡</m:t>
+          </m:r>
+          <m:limLow>
+            <m:limLowPr>
+              <m:ctrlPr>
+                <w:rPr>
+                  <w:rFonts w:ascii="Cambria Math" w:hAnsi="Cambria Math"/>
+                  <w:i/>
+                  <w:color w:val="0070C0"/>
+                </w:rPr>
+              </m:ctrlPr>
+            </m:limLowPr>
+            <m:e>
+              <m:r>
+                <w:rPr>
+                  <w:rFonts w:ascii="Cambria Math" w:hAnsi="Cambria Math"/>
+                  <w:color w:val="0070C0"/>
+                </w:rPr>
+                <m:t>max⁡</m:t>
+              </m:r>
+            </m:e>
+            <m:lim>
+              <m:r>
+                <w:rPr>
+                  <w:rFonts w:ascii="Cambria Math" w:hAnsi="Cambria Math"/>
+                  <w:color w:val="0070C0"/>
+                </w:rPr>
+                <m:t>p∈ActivePackages</m:t>
+              </m:r>
+            </m:lim>
+          </m:limLow>
+          <m:r>
+            <w:rPr>
+              <w:rFonts w:ascii="Cambria Math" w:hAnsi="Cambria Math"/>
+              <w:color w:val="0070C0"/>
+            </w:rPr>
+            <m:t>PackageCandidate(s,r,p)</m:t>
+          </m:r>
+        </m:oMath>
+      </m:oMathPara>
+    </w:p>
+    <w:p>
+      <w:pPr>
+        <w:spacing w:after="464" w:line="291" w:lineRule="auto"/>
+        <w:ind w:right="166"/>
+        <w:jc w:val="left"/>
+        <w:rPr>
+          <w:color w:val="0070C0"/>
+          <w:rtl/>
+        </w:rPr>
+      </w:pPr>
+      <w:r>
+        <w:rPr>
+          <w:rFonts w:hint="cs"/>
+          <w:color w:val="0070C0"/>
+          <w:rtl/>
+        </w:rPr>
+        <w:t>עכשיו אגדיר את</w:t>
+      </w:r>
+      <w:r>
+        <w:rPr>
+          <w:rFonts w:hint="cs"/>
+          <w:color w:val="0070C0"/>
+          <w:rtl/>
+        </w:rPr>
+        <w:t xml:space="preserve"> </w:t>
+      </w:r>
+      <w:r>
+        <w:rPr>
+          <w:rFonts w:ascii="Cambria Math" w:hAnsi="Cambria Math"/>
+          <w:i/>
+          <w:color w:val="0070C0"/>
+        </w:rPr>
+        <w:t xml:space="preserve"> </w:t>
+      </w:r>
+      <m:oMath>
+        <m:r>
+          <w:rPr>
+            <w:rFonts w:ascii="Cambria Math" w:hAnsi="Cambria Math"/>
+            <w:color w:val="0070C0"/>
+          </w:rPr>
+          <m:t>RouteDist</m:t>
+        </m:r>
+      </m:oMath>
+      <w:r>
+        <w:rPr>
+          <w:rFonts w:hint="cs"/>
+          <w:color w:val="0070C0"/>
+          <w:rtl/>
+        </w:rPr>
+        <w:t xml:space="preserve"> </w:t>
+      </w:r>
+      <w:r>
+        <w:rPr>
+          <w:rFonts w:hint="cs"/>
+          <w:color w:val="0070C0"/>
+          <w:rtl/>
+        </w:rPr>
+        <w:t xml:space="preserve"> אם הרובוט </w:t>
+      </w:r>
+      <w:r>
+        <w:rPr>
+          <w:color w:val="0070C0"/>
+        </w:rPr>
+        <w:t>r</w:t>
+      </w:r>
+      <w:r>
+        <w:rPr>
+          <w:rFonts w:hint="cs"/>
+          <w:color w:val="0070C0"/>
+          <w:rtl/>
+        </w:rPr>
+        <w:t xml:space="preserve"> סוחב חבילה </w:t>
+      </w:r>
+      <w:r>
+        <w:rPr>
+          <w:color w:val="0070C0"/>
+        </w:rPr>
+        <w:t>p*</w:t>
+      </w:r>
+      <w:r>
+        <w:rPr>
+          <w:rFonts w:hint="cs"/>
+          <w:color w:val="0070C0"/>
+          <w:rtl/>
+        </w:rPr>
+        <w:t>:</w:t>
+      </w:r>
+      <w:r>
+        <w:rPr>
+          <w:color w:val="0070C0"/>
+          <w:rtl/>
+        </w:rPr>
+        <w:br/>
+      </w:r>
+      <m:oMathPara>
+        <m:oMath>
+          <m:r>
+            <w:rPr>
+              <w:rFonts w:ascii="Cambria Math" w:hAnsi="Cambria Math"/>
+              <w:color w:val="0070C0"/>
+            </w:rPr>
+            <m:t>RouteDist</m:t>
+          </m:r>
+          <m:r>
+            <w:rPr>
+              <w:rFonts w:ascii="Cambria Math" w:hAnsi="Cambria Math"/>
+              <w:color w:val="0070C0"/>
+            </w:rPr>
+            <m:t>(s,r</m:t>
+          </m:r>
+          <m:r>
+            <w:rPr>
+              <w:rFonts w:ascii="Cambria Math" w:hAnsi="Cambria Math"/>
+              <w:color w:val="0070C0"/>
+            </w:rPr>
+            <m:t>,</m:t>
+          </m:r>
+          <m:sSup>
+            <m:sSupPr>
+              <m:ctrlPr>
+                <w:rPr>
+                  <w:rFonts w:ascii="Cambria Math" w:hAnsi="Cambria Math"/>
+                  <w:i/>
+                  <w:color w:val="0070C0"/>
+                </w:rPr>
+              </m:ctrlPr>
+            </m:sSupPr>
+            <m:e>
+              <m:r>
+                <w:rPr>
+                  <w:rFonts w:ascii="Cambria Math" w:hAnsi="Cambria Math"/>
+                  <w:color w:val="0070C0"/>
+                </w:rPr>
+                <m:t>p</m:t>
+              </m:r>
+            </m:e>
+            <m:sup>
+              <m:r>
+                <w:rPr>
+                  <w:rFonts w:ascii="Cambria Math" w:hAnsi="Cambria Math"/>
+                  <w:color w:val="0070C0"/>
+                </w:rPr>
+                <m:t>*</m:t>
+              </m:r>
+            </m:sup>
+          </m:sSup>
+          <m:r>
+            <w:rPr>
+              <w:rFonts w:ascii="Cambria Math" w:hAnsi="Cambria Math"/>
+              <w:color w:val="0070C0"/>
+            </w:rPr>
+            <m:t>)</m:t>
+          </m:r>
+          <m:r>
+            <w:rPr>
+              <w:rFonts w:ascii="Cambria Math" w:hAnsi="Cambria Math"/>
+              <w:color w:val="0070C0"/>
+            </w:rPr>
+            <m:t>=Manhattan(position(r),destination(</m:t>
+          </m:r>
+          <m:sSup>
+            <m:sSupPr>
+              <m:ctrlPr>
+                <w:rPr>
+                  <w:rFonts w:ascii="Cambria Math" w:hAnsi="Cambria Math"/>
+                  <w:i/>
+                  <w:color w:val="0070C0"/>
+                </w:rPr>
+              </m:ctrlPr>
+            </m:sSupPr>
+            <m:e>
+              <m:r>
+                <w:rPr>
+                  <w:rFonts w:ascii="Cambria Math" w:hAnsi="Cambria Math"/>
+                  <w:color w:val="0070C0"/>
+                </w:rPr>
+                <m:t>p</m:t>
+              </m:r>
+            </m:e>
+            <m:sup>
+              <m:r>
+                <w:rPr>
+                  <w:rFonts w:ascii="Cambria Math" w:hAnsi="Cambria Math"/>
+                  <w:color w:val="0070C0"/>
+                </w:rPr>
+                <m:t>*</m:t>
+              </m:r>
+            </m:sup>
+          </m:sSup>
+          <m:r>
+            <w:rPr>
+              <w:rFonts w:ascii="Cambria Math" w:hAnsi="Cambria Math"/>
+              <w:color w:val="0070C0"/>
+            </w:rPr>
+            <m:t>))</m:t>
+          </m:r>
+        </m:oMath>
+      </m:oMathPara>
+    </w:p>
+    <w:p>
+      <w:pPr>
+        <w:spacing w:after="464" w:line="291" w:lineRule="auto"/>
+        <w:ind w:right="166"/>
+        <w:jc w:val="left"/>
+        <w:rPr>
+          <w:color w:val="0070C0"/>
+          <w:rtl/>
+        </w:rPr>
+      </w:pPr>
+      <w:r>
+        <w:rPr>
+          <w:rFonts w:hint="cs"/>
+          <w:color w:val="0070C0"/>
+          <w:rtl/>
+        </w:rPr>
+        <w:t xml:space="preserve">אם הוא לא אז: </w:t>
+      </w:r>
+    </w:p>
+    <w:p>
+      <w:pPr>
+        <w:spacing w:after="464" w:line="291" w:lineRule="auto"/>
+        <w:ind w:right="166"/>
+        <w:jc w:val="left"/>
+        <w:rPr>
+          <w:rFonts w:ascii="Cambria Math" w:hAnsi="Cambria Math"/>
+          <w:i/>
+          <w:color w:val="0070C0"/>
+        </w:rPr>
+      </w:pPr>
+      <m:oMathPara>
+        <m:oMath>
+          <m:r>
+            <w:rPr>
+              <w:rFonts w:ascii="Cambria Math" w:hAnsi="Cambria Math"/>
+              <w:color w:val="0070C0"/>
+            </w:rPr>
+            <m:t>RouteDist</m:t>
+          </m:r>
+          <m:r>
+            <w:rPr>
+              <w:rFonts w:ascii="Cambria Math" w:hAnsi="Cambria Math"/>
+              <w:color w:val="0070C0"/>
+            </w:rPr>
+            <m:t>(s,r</m:t>
+          </m:r>
+          <m:r>
+            <w:rPr>
+              <w:rFonts w:ascii="Cambria Math" w:hAnsi="Cambria Math"/>
+              <w:color w:val="0070C0"/>
+            </w:rPr>
+            <m:t>,</m:t>
+          </m:r>
+          <m:sSup>
+            <m:sSupPr>
+              <m:ctrlPr>
+                <w:rPr>
+                  <w:rFonts w:ascii="Cambria Math" w:hAnsi="Cambria Math"/>
+                  <w:i/>
+                  <w:color w:val="0070C0"/>
+                </w:rPr>
+              </m:ctrlPr>
+            </m:sSupPr>
+            <m:e>
+              <m:r>
+                <w:rPr>
+                  <w:rFonts w:ascii="Cambria Math" w:hAnsi="Cambria Math"/>
+                  <w:color w:val="0070C0"/>
+                </w:rPr>
+                <m:t>p</m:t>
+              </m:r>
+            </m:e>
+            <m:sup>
+              <m:r>
+                <w:rPr>
+                  <w:rFonts w:ascii="Cambria Math" w:hAnsi="Cambria Math"/>
+                  <w:color w:val="0070C0"/>
+                </w:rPr>
+                <m:t>*</m:t>
+              </m:r>
+            </m:sup>
+          </m:sSup>
+          <m:r>
+            <w:rPr>
+              <w:rFonts w:ascii="Cambria Math" w:hAnsi="Cambria Math"/>
+              <w:color w:val="0070C0"/>
+            </w:rPr>
+            <m:t>)=Manhattan(position(r),position(</m:t>
+          </m:r>
+          <m:sSup>
+            <m:sSupPr>
+              <m:ctrlPr>
+                <w:rPr>
+                  <w:rFonts w:ascii="Cambria Math" w:hAnsi="Cambria Math"/>
+                  <w:i/>
+                  <w:color w:val="0070C0"/>
+                </w:rPr>
+              </m:ctrlPr>
+            </m:sSupPr>
+            <m:e>
+              <m:r>
+                <w:rPr>
+                  <w:rFonts w:ascii="Cambria Math" w:hAnsi="Cambria Math"/>
+                  <w:color w:val="0070C0"/>
+                </w:rPr>
+                <m:t>p</m:t>
+              </m:r>
+            </m:e>
+            <m:sup>
+              <m:r>
+                <w:rPr>
+                  <w:rFonts w:ascii="Cambria Math" w:hAnsi="Cambria Math"/>
+                  <w:color w:val="0070C0"/>
+                </w:rPr>
+                <m:t>*</m:t>
+              </m:r>
+            </m:sup>
+          </m:sSup>
+          <m:r>
+            <w:rPr>
+              <w:rFonts w:ascii="Cambria Math" w:hAnsi="Cambria Math"/>
+              <w:color w:val="0070C0"/>
+            </w:rPr>
+            <m:t>))+Manhattan(position(</m:t>
+          </m:r>
+          <m:sSup>
+            <m:sSupPr>
+              <m:ctrlPr>
+                <w:rPr>
+                  <w:rFonts w:ascii="Cambria Math" w:hAnsi="Cambria Math"/>
+                  <w:i/>
+                  <w:color w:val="0070C0"/>
+                </w:rPr>
+              </m:ctrlPr>
+            </m:sSupPr>
+            <m:e>
+              <m:r>
+                <w:rPr>
+                  <w:rFonts w:ascii="Cambria Math" w:hAnsi="Cambria Math"/>
+                  <w:color w:val="0070C0"/>
+                </w:rPr>
+                <m:t>p</m:t>
+              </m:r>
+            </m:e>
+            <m:sup>
+              <m:r>
+                <w:rPr>
+                  <w:rFonts w:ascii="Cambria Math" w:hAnsi="Cambria Math"/>
+                  <w:color w:val="0070C0"/>
+                </w:rPr>
+                <m:t>*</m:t>
+              </m:r>
+            </m:sup>
+          </m:sSup>
+          <m:r>
+            <w:rPr>
+              <w:rFonts w:ascii="Cambria Math" w:hAnsi="Cambria Math"/>
+              <w:color w:val="0070C0"/>
+            </w:rPr>
+            <m:t>),destination(</m:t>
+          </m:r>
+          <m:sSup>
+            <m:sSupPr>
+              <m:ctrlPr>
+                <w:rPr>
+                  <w:rFonts w:ascii="Cambria Math" w:hAnsi="Cambria Math"/>
+                  <w:i/>
+                  <w:color w:val="0070C0"/>
+                </w:rPr>
+              </m:ctrlPr>
+            </m:sSupPr>
+            <m:e>
+              <m:r>
+                <w:rPr>
+                  <w:rFonts w:ascii="Cambria Math" w:hAnsi="Cambria Math"/>
+                  <w:color w:val="0070C0"/>
+                </w:rPr>
+                <m:t>p</m:t>
+              </m:r>
+            </m:e>
+            <m:sup>
+              <m:r>
+                <w:rPr>
+                  <w:rFonts w:ascii="Cambria Math" w:hAnsi="Cambria Math"/>
+                  <w:color w:val="0070C0"/>
+                </w:rPr>
+                <m:t>*</m:t>
+              </m:r>
+            </m:sup>
+          </m:sSup>
+          <m:r>
+            <w:rPr>
+              <w:rFonts w:ascii="Cambria Math" w:hAnsi="Cambria Math"/>
+              <w:color w:val="0070C0"/>
+            </w:rPr>
+            <m:t>))</m:t>
+          </m:r>
+          <m:r>
+            <w:rPr>
+              <w:rFonts w:ascii="Cambria Math" w:hAnsi="Cambria Math"/>
+              <w:i/>
+              <w:color w:val="0070C0"/>
+            </w:rPr>
+            <w:br/>
+          </m:r>
+        </m:oMath>
+      </m:oMathPara>
+      <w:r>
+        <w:rPr>
+          <w:rFonts w:ascii="Cambria Math" w:hAnsi="Cambria Math" w:hint="cs"/>
+          <w:i/>
+          <w:color w:val="0070C0"/>
+          <w:rtl/>
+        </w:rPr>
+        <w:t>ואז נגדיר:</w:t>
+      </w:r>
+    </w:p>
+    <w:p>
+      <w:pPr>
+        <w:spacing w:after="464" w:line="291" w:lineRule="auto"/>
+        <w:ind w:right="166"/>
+        <w:jc w:val="left"/>
+        <w:rPr>
+          <w:rFonts w:ascii="Cambria Math" w:hAnsi="Cambria Math"/>
+          <w:i/>
+          <w:color w:val="0070C0"/>
+        </w:rPr>
+      </w:pPr>
+      <m:oMathPara>
+        <m:oMath>
+          <m:r>
+            <w:rPr>
+              <w:rFonts w:ascii="Cambria Math" w:hAnsi="Cambria Math"/>
+              <w:color w:val="0070C0"/>
+            </w:rPr>
+            <m:t>PackageUtility(s,r)=Reward(</m:t>
+          </m:r>
+          <m:sSup>
+            <m:sSupPr>
+              <m:ctrlPr>
+                <w:rPr>
+                  <w:rFonts w:ascii="Cambria Math" w:hAnsi="Cambria Math"/>
+                  <w:i/>
+                  <w:color w:val="0070C0"/>
+                </w:rPr>
+              </m:ctrlPr>
+            </m:sSupPr>
+            <m:e>
+              <m:r>
+                <w:rPr>
+                  <w:rFonts w:ascii="Cambria Math" w:hAnsi="Cambria Math"/>
+                  <w:color w:val="0070C0"/>
+                </w:rPr>
+                <m:t>p</m:t>
+              </m:r>
+            </m:e>
+            <m:sup>
+              <m:r>
+                <w:rPr>
+                  <w:rFonts w:ascii="Cambria Math" w:hAnsi="Cambria Math"/>
+                  <w:color w:val="0070C0"/>
+                </w:rPr>
+                <m:t>*</m:t>
+              </m:r>
+            </m:sup>
+          </m:sSup>
+          <m:r>
+            <w:rPr>
+              <w:rFonts w:ascii="Cambria Math" w:hAnsi="Cambria Math"/>
+              <w:color w:val="0070C0"/>
+            </w:rPr>
+            <m:t>)-RouteDist(s,r,</m:t>
+          </m:r>
+          <m:sSup>
+            <m:sSupPr>
+              <m:ctrlPr>
+                <w:rPr>
+                  <w:rFonts w:ascii="Cambria Math" w:hAnsi="Cambria Math"/>
+                  <w:i/>
+                  <w:color w:val="0070C0"/>
+                </w:rPr>
+              </m:ctrlPr>
+            </m:sSupPr>
+            <m:e>
+              <m:r>
+                <w:rPr>
+                  <w:rFonts w:ascii="Cambria Math" w:hAnsi="Cambria Math"/>
+                  <w:color w:val="0070C0"/>
+                </w:rPr>
+                <m:t>p</m:t>
+              </m:r>
+            </m:e>
+            <m:sup>
+              <m:r>
+                <w:rPr>
+                  <w:rFonts w:ascii="Cambria Math" w:hAnsi="Cambria Math"/>
+                  <w:color w:val="0070C0"/>
+                </w:rPr>
+                <m:t>*</m:t>
+              </m:r>
+            </m:sup>
+          </m:sSup>
+          <m:r>
+            <w:rPr>
+              <w:rFonts w:ascii="Cambria Math" w:hAnsi="Cambria Math"/>
+              <w:color w:val="0070C0"/>
+            </w:rPr>
+            <m:t>)</m:t>
+          </m:r>
+        </m:oMath>
+      </m:oMathPara>
+    </w:p>
+    <w:p>
+      <w:pPr>
+        <w:spacing w:after="464" w:line="291" w:lineRule="auto"/>
+        <w:ind w:right="166"/>
+        <w:jc w:val="left"/>
+        <w:rPr>
+          <w:rFonts w:ascii="Cambria Math" w:hAnsi="Cambria Math"/>
+          <w:i/>
+          <w:color w:val="0070C0"/>
+          <w:rtl/>
+        </w:rPr>
+      </w:pPr>
+      <w:r>
+        <w:rPr>
+          <w:rFonts w:ascii="Cambria Math" w:hAnsi="Cambria Math" w:hint="cs"/>
+          <w:i/>
+          <w:color w:val="0070C0"/>
+          <w:rtl/>
+        </w:rPr>
+        <w:t xml:space="preserve">אחרי כן נגדיר </w:t>
+      </w:r>
+      <w:r>
+        <w:rPr>
+          <w:rFonts w:ascii="Cambria Math" w:hAnsi="Cambria Math" w:hint="cs"/>
+          <w:i/>
+          <w:color w:val="0070C0"/>
+          <w:rtl/>
+        </w:rPr>
+        <w:t>החוסר בסוללה:</w:t>
+      </w:r>
+    </w:p>
+    <w:p>
+      <w:pPr>
+        <w:spacing w:after="464" w:line="291" w:lineRule="auto"/>
+        <w:ind w:right="166"/>
+        <w:jc w:val="left"/>
+        <w:rPr>
+          <w:rFonts w:ascii="Cambria Math" w:hAnsi="Cambria Math" w:hint="cs"/>
+          <w:i/>
+          <w:color w:val="0070C0"/>
+          <w:rtl/>
+        </w:rPr>
+      </w:pPr>
+      <m:oMathPara>
+        <m:oMath>
+          <m:r>
+            <w:rPr>
+              <w:rFonts w:ascii="Cambria Math" w:hAnsi="Cambria Math"/>
+              <w:color w:val="0070C0"/>
+            </w:rPr>
+            <m:t>BatteryShortage(s,r)=max(0,RouteDist(s,r,</m:t>
+          </m:r>
+          <m:sSup>
+            <m:sSupPr>
+              <m:ctrlPr>
+                <w:rPr>
+                  <w:rFonts w:ascii="Cambria Math" w:hAnsi="Cambria Math"/>
+                  <w:i/>
+                  <w:color w:val="0070C0"/>
+                </w:rPr>
+              </m:ctrlPr>
+            </m:sSupPr>
+            <m:e>
+              <m:r>
+                <w:rPr>
+                  <w:rFonts w:ascii="Cambria Math" w:hAnsi="Cambria Math"/>
+                  <w:color w:val="0070C0"/>
+                </w:rPr>
+                <m:t>p</m:t>
+              </m:r>
+            </m:e>
+            <m:sup>
+              <m:r>
+                <w:rPr>
+                  <w:rFonts w:ascii="Cambria Math" w:hAnsi="Cambria Math"/>
+                  <w:color w:val="0070C0"/>
+                </w:rPr>
+                <m:t>*</m:t>
+              </m:r>
+            </m:sup>
+          </m:sSup>
+          <m:r>
+            <w:rPr>
+              <w:rFonts w:ascii="Cambria Math" w:hAnsi="Cambria Math"/>
+              <w:color w:val="0070C0"/>
+            </w:rPr>
+            <m:t>)-battery(r))</m:t>
+          </m:r>
+        </m:oMath>
+      </m:oMathPara>
+    </w:p>
+    <w:p>
+      <w:pPr>
+        <w:spacing w:after="464" w:line="291" w:lineRule="auto"/>
+        <w:ind w:right="166"/>
+        <w:jc w:val="left"/>
+        <w:rPr>
+          <w:rFonts w:ascii="Cambria Math" w:hAnsi="Cambria Math"/>
+          <w:i/>
+          <w:color w:val="0070C0"/>
+          <w:rtl/>
+        </w:rPr>
+      </w:pPr>
+      <w:r>
+        <w:rPr>
+          <w:rFonts w:ascii="Cambria Math" w:hAnsi="Cambria Math"/>
+          <w:i/>
+          <w:color w:val="0070C0"/>
+          <w:rtl/>
+        </w:rPr>
+        <w:t>כלומר, אם לרובוט יש מספיק סוללה כדי להשלים את המסלול הנוכחי, ערך זה יהיה</w:t>
+      </w:r>
+      <w:r>
+        <w:rPr>
+          <w:rFonts w:ascii="Cambria Math" w:hAnsi="Cambria Math" w:hint="cs"/>
+          <w:i/>
+          <w:color w:val="0070C0"/>
+          <w:rtl/>
+        </w:rPr>
+        <w:t xml:space="preserve"> 0.</w:t>
+      </w:r>
+      <w:r>
+        <w:rPr>
+          <w:rFonts w:ascii="Cambria Math" w:hAnsi="Cambria Math"/>
+          <w:i/>
+          <w:color w:val="0070C0"/>
+        </w:rPr>
+        <w:t xml:space="preserve"> </w:t>
+      </w:r>
+      <w:r>
+        <w:rPr>
+          <w:rFonts w:ascii="Cambria Math" w:hAnsi="Cambria Math"/>
+          <w:i/>
+          <w:color w:val="0070C0"/>
+          <w:rtl/>
+        </w:rPr>
+        <w:t>אם אין לו מספיק סוללה, הערך ימדוד בכמה צעדים חסרה לו סוללה</w:t>
+      </w:r>
+      <w:r>
+        <w:rPr>
+          <w:rFonts w:ascii="Cambria Math" w:hAnsi="Cambria Math"/>
+          <w:i/>
+          <w:color w:val="0070C0"/>
+        </w:rPr>
+        <w:t>.</w:t>
+      </w:r>
+    </w:p>
+    <w:p>
+      <w:pPr>
+        <w:spacing w:after="464" w:line="291" w:lineRule="auto"/>
+        <w:ind w:right="166"/>
+        <w:jc w:val="left"/>
+        <w:rPr>
+          <w:rFonts w:ascii="Cambria Math" w:hAnsi="Cambria Math" w:hint="cs"/>
+          <w:i/>
+          <w:color w:val="0070C0"/>
+          <w:rtl/>
+        </w:rPr>
+      </w:pPr>
+      <w:r>
+        <w:rPr>
+          <w:rFonts w:ascii="Cambria Math" w:hAnsi="Cambria Math" w:hint="cs"/>
+          <w:i/>
+          <w:color w:val="0070C0"/>
+          <w:rtl/>
+        </w:rPr>
+        <w:t>המרחק לתחנת הטעינה הקרובה ביותר:</w:t>
+      </w:r>
+    </w:p>
+    <w:p>
+      <w:pPr>
+        <w:spacing w:after="464" w:line="291" w:lineRule="auto"/>
+        <w:ind w:right="166"/>
+        <w:jc w:val="left"/>
+        <w:rPr>
+          <w:rFonts w:ascii="Cambria Math" w:hAnsi="Cambria Math"/>
+          <w:i/>
+          <w:color w:val="0070C0"/>
+        </w:rPr>
+      </w:pPr>
+      <m:oMathPara>
+        <m:oMath>
+          <m:r>
+            <w:rPr>
+              <w:rFonts w:ascii="Cambria Math" w:hAnsi="Cambria Math"/>
+              <w:color w:val="0070C0"/>
+            </w:rPr>
+            <m:t>ChargeDist(s,r)=</m:t>
+          </m:r>
+          <m:limLow>
+            <m:limLowPr>
+              <m:ctrlPr>
+                <w:rPr>
+                  <w:rFonts w:ascii="Cambria Math" w:hAnsi="Cambria Math"/>
+                  <w:i/>
+                  <w:color w:val="0070C0"/>
+                </w:rPr>
+              </m:ctrlPr>
+            </m:limLowPr>
+            <m:e>
+              <m:r>
+                <w:rPr>
+                  <w:rFonts w:ascii="Cambria Math" w:hAnsi="Cambria Math"/>
+                  <w:color w:val="0070C0"/>
+                </w:rPr>
+                <m:t>min⁡</m:t>
+              </m:r>
+            </m:e>
+            <m:lim>
+              <m:r>
+                <w:rPr>
+                  <w:rFonts w:ascii="Cambria Math" w:hAnsi="Cambria Math"/>
+                  <w:color w:val="0070C0"/>
+                </w:rPr>
+                <m:t>c∈ChargingStations</m:t>
+              </m:r>
+            </m:lim>
+          </m:limLow>
+          <m:r>
+            <w:rPr>
+              <w:rFonts w:ascii="Cambria Math" w:hAnsi="Cambria Math"/>
+              <w:color w:val="0070C0"/>
+            </w:rPr>
+            <m:t>Manhattan(position(r),c)</m:t>
+          </m:r>
+          <m:r>
+            <w:rPr>
+              <w:rFonts w:ascii="Cambria Math" w:hAnsi="Cambria Math"/>
+              <w:i/>
+              <w:color w:val="0070C0"/>
+            </w:rPr>
+            <w:br/>
+          </m:r>
+        </m:oMath>
+      </m:oMathPara>
+      <w:r>
+        <w:rPr>
+          <w:rFonts w:ascii="Cambria Math" w:hAnsi="Cambria Math"/>
+          <w:i/>
+          <w:color w:val="0070C0"/>
+          <w:rtl/>
+        </w:rPr>
+        <w:t>תחנת טעינה רלוונטית רק כאשר לרובוט אין מספיק סוללה להשלים את המסלול הנוכחי. לכן נגדיר</w:t>
+      </w:r>
+      <w:r>
+        <w:rPr>
+          <w:rFonts w:ascii="Cambria Math" w:hAnsi="Cambria Math" w:hint="cs"/>
+          <w:i/>
+          <w:color w:val="0070C0"/>
+          <w:rtl/>
+        </w:rPr>
+        <w:t>:</w:t>
+      </w:r>
+    </w:p>
+    <w:p>
+      <w:pPr>
+        <w:spacing w:after="464" w:line="291" w:lineRule="auto"/>
+        <w:ind w:right="166"/>
+        <w:jc w:val="left"/>
+        <w:rPr>
+          <w:rFonts w:ascii="Cambria Math" w:hAnsi="Cambria Math"/>
+          <w:i/>
+          <w:color w:val="0070C0"/>
+          <w:rtl/>
+        </w:rPr>
+      </w:pPr>
+      <m:oMathPara>
+        <m:oMath>
+          <m:r>
+            <w:rPr>
+              <w:rFonts w:ascii="Cambria Math" w:hAnsi="Cambria Math"/>
+              <w:color w:val="0070C0"/>
+            </w:rPr>
+            <m:t>ChargePenalty(s,r)=</m:t>
+          </m:r>
+          <m:d>
+            <m:dPr>
+              <m:begChr m:val="{"/>
+              <m:endChr m:val=""/>
+              <m:ctrlPr>
+                <w:rPr>
+                  <w:rFonts w:ascii="Cambria Math" w:hAnsi="Cambria Math"/>
+                  <w:i/>
+                  <w:color w:val="0070C0"/>
+                </w:rPr>
+              </m:ctrlPr>
+            </m:dPr>
+            <m:e>
+              <m:m>
+                <m:mPr>
+                  <m:plcHide m:val="1"/>
+                  <m:mcs>
+                    <m:mc>
+                      <m:mcPr>
+                        <m:count m:val="2"/>
+                        <m:mcJc m:val="center"/>
+                      </m:mcPr>
+                    </m:mc>
+                  </m:mcs>
+                  <m:ctrlPr>
+                    <w:rPr>
+                      <w:rFonts w:ascii="Cambria Math" w:hAnsi="Cambria Math"/>
+                      <w:i/>
+                      <w:color w:val="0070C0"/>
+                    </w:rPr>
+                  </m:ctrlPr>
+                </m:mPr>
+                <m:mr>
+                  <m:e>
+                    <m:r>
+                      <w:rPr>
+                        <w:rFonts w:ascii="Cambria Math" w:hAnsi="Cambria Math"/>
+                        <w:color w:val="0070C0"/>
+                      </w:rPr>
+                      <m:t>ChargeDist(s,r)</m:t>
+                    </m:r>
+                  </m:e>
+                  <m:e>
+                    <m:r>
+                      <m:rPr>
+                        <m:nor/>
+                      </m:rPr>
+                      <w:rPr>
+                        <w:rFonts w:ascii="Cambria Math" w:hAnsi="Cambria Math"/>
+                        <w:iCs/>
+                        <w:color w:val="0070C0"/>
+                      </w:rPr>
+                      <m:t>if</m:t>
+                    </m:r>
+                    <m:r>
+                      <m:rPr>
+                        <m:nor/>
+                      </m:rPr>
+                      <w:rPr>
+                        <w:rFonts w:ascii="Cambria Math" w:hAnsi="Cambria Math"/>
+                        <w:i/>
+                        <w:color w:val="0070C0"/>
+                      </w:rPr>
+                      <m:t xml:space="preserve"> </m:t>
+                    </m:r>
+                    <m:r>
+                      <w:rPr>
+                        <w:rFonts w:ascii="Cambria Math" w:hAnsi="Cambria Math"/>
+                        <w:color w:val="0070C0"/>
+                      </w:rPr>
+                      <m:t>BatteryShortage(s,r)&gt;0</m:t>
+                    </m:r>
+                  </m:e>
+                </m:mr>
+                <m:mr>
+                  <m:e>
+                    <m:r>
+                      <w:rPr>
+                        <w:rFonts w:ascii="Cambria Math" w:hAnsi="Cambria Math"/>
+                        <w:color w:val="0070C0"/>
+                      </w:rPr>
+                      <m:t>0</m:t>
+                    </m:r>
+                  </m:e>
+                  <m:e>
+                    <m:r>
+                      <m:rPr>
+                        <m:nor/>
+                      </m:rPr>
+                      <w:rPr>
+                        <w:rFonts w:ascii="Cambria Math" w:hAnsi="Cambria Math"/>
+                        <w:i/>
+                        <w:color w:val="0070C0"/>
+                      </w:rPr>
+                      <m:t>otherwise</m:t>
+                    </m:r>
+                  </m:e>
+                </m:mr>
+              </m:m>
+            </m:e>
+          </m:d>
+        </m:oMath>
+      </m:oMathPara>
+    </w:p>
+    <w:p>
+      <w:pPr>
+        <w:spacing w:after="464" w:line="291" w:lineRule="auto"/>
+        <w:ind w:right="166"/>
+        <w:jc w:val="left"/>
+        <w:rPr>
+          <w:rFonts w:ascii="Cambria Math" w:hAnsi="Cambria Math"/>
+          <w:i/>
+          <w:color w:val="0070C0"/>
+          <w:rtl/>
+        </w:rPr>
+      </w:pPr>
+      <m:oMathPara>
+        <m:oMath>
+          <m:r>
+            <w:rPr>
+              <w:rFonts w:ascii="Cambria Math" w:hAnsi="Cambria Math"/>
+              <w:color w:val="0070C0"/>
+            </w:rPr>
+            <m:t>EnergyRisk(s,r)=BatteryShortage(s,r)+0.5⋅ChargePenalty(s,r)</m:t>
+          </m:r>
+        </m:oMath>
+      </m:oMathPara>
+    </w:p>
+    <w:p>
+      <w:pPr>
+        <w:spacing w:after="464" w:line="291" w:lineRule="auto"/>
+        <w:ind w:right="166"/>
+        <w:jc w:val="left"/>
+        <w:rPr>
+          <w:rFonts w:ascii="Cambria Math" w:hAnsi="Cambria Math"/>
+          <w:i/>
+          <w:color w:val="0070C0"/>
+        </w:rPr>
+      </w:pPr>
+      <w:r>
+        <w:rPr>
+          <w:rFonts w:ascii="Cambria Math" w:hAnsi="Cambria Math"/>
+          <w:i/>
+          <w:color w:val="0070C0"/>
+          <w:rtl/>
+        </w:rPr>
+        <w:lastRenderedPageBreak/>
+        <w:t xml:space="preserve">בעזרת </w:t>
+      </w:r>
+      <m:oMath>
+        <m:r>
+          <w:rPr>
+            <w:rFonts w:ascii="Cambria Math" w:hAnsi="Cambria Math"/>
+            <w:color w:val="0070C0"/>
+          </w:rPr>
+          <m:t>EnergyRisk</m:t>
+        </m:r>
+      </m:oMath>
+      <w:r>
+        <w:rPr>
+          <w:rFonts w:ascii="Cambria Math" w:hAnsi="Cambria Math"/>
+          <w:i/>
+          <w:color w:val="0070C0"/>
+          <w:rtl/>
+        </w:rPr>
+        <w:t>, כאשר לרובוט אין מספיק סוללה להשלים את המסלול, מצב שבו הוא קרוב יותר לתחנת טעינה יקבל ערך היוריסטי טוב יותר, משום ש</w:t>
+      </w:r>
+      <m:oMath>
+        <m:r>
+          <w:rPr>
+            <w:rFonts w:ascii="Cambria Math" w:hAnsi="Cambria Math"/>
+            <w:color w:val="0070C0"/>
+          </w:rPr>
+          <m:t>ChargeDist</m:t>
+        </m:r>
+      </m:oMath>
+      <w:r>
+        <w:rPr>
+          <w:rFonts w:ascii="Cambria Math" w:hAnsi="Cambria Math"/>
+          <w:i/>
+          <w:color w:val="0070C0"/>
+        </w:rPr>
+        <w:t xml:space="preserve"> </w:t>
+      </w:r>
+      <w:r>
+        <w:rPr>
+          <w:rFonts w:ascii="Cambria Math" w:hAnsi="Cambria Math"/>
+          <w:i/>
+          <w:color w:val="0070C0"/>
+          <w:rtl/>
+        </w:rPr>
+        <w:t xml:space="preserve">קטן יותר ולכן גם </w:t>
+      </w:r>
+      <m:oMath>
+        <m:r>
+          <w:rPr>
+            <w:rFonts w:ascii="Cambria Math" w:hAnsi="Cambria Math"/>
+            <w:color w:val="0070C0"/>
+          </w:rPr>
+          <m:t>EnergyRisk</m:t>
+        </m:r>
+      </m:oMath>
+      <w:r>
+        <w:rPr>
+          <w:rFonts w:ascii="Cambria Math" w:hAnsi="Cambria Math"/>
+          <w:i/>
+          <w:color w:val="0070C0"/>
+        </w:rPr>
+        <w:t xml:space="preserve"> </w:t>
+      </w:r>
+      <w:r>
+        <w:rPr>
+          <w:rFonts w:ascii="Cambria Math" w:hAnsi="Cambria Math"/>
+          <w:i/>
+          <w:color w:val="0070C0"/>
+          <w:rtl/>
+        </w:rPr>
+        <w:t>קטן יותר. לעומת זאת, אם יש מספיק סוללה</w:t>
+      </w:r>
+      <w:r>
+        <w:rPr>
+          <w:rFonts w:ascii="Cambria Math" w:hAnsi="Cambria Math" w:hint="cs"/>
+          <w:i/>
+          <w:color w:val="0070C0"/>
+          <w:rtl/>
+        </w:rPr>
+        <w:t xml:space="preserve">, </w:t>
+      </w:r>
+      <w:r>
+        <w:rPr>
+          <w:rFonts w:ascii="Cambria Math" w:hAnsi="Cambria Math"/>
+          <w:i/>
+          <w:color w:val="0070C0"/>
+        </w:rPr>
+        <w:t xml:space="preserve"> </w:t>
+      </w:r>
+      <m:oMath>
+        <m:r>
+          <w:rPr>
+            <w:rFonts w:ascii="Cambria Math" w:hAnsi="Cambria Math"/>
+            <w:color w:val="0070C0"/>
+          </w:rPr>
+          <m:t>ChargePenalty=0</m:t>
+        </m:r>
+      </m:oMath>
+      <w:r>
+        <w:rPr>
+          <w:rFonts w:ascii="Cambria Math" w:hAnsi="Cambria Math" w:hint="cs"/>
+          <w:i/>
+          <w:color w:val="0070C0"/>
+          <w:rtl/>
+        </w:rPr>
+        <w:t xml:space="preserve"> </w:t>
+      </w:r>
+      <w:r>
+        <w:rPr>
+          <w:rFonts w:ascii="Cambria Math" w:hAnsi="Cambria Math"/>
+          <w:i/>
+          <w:color w:val="0070C0"/>
+          <w:rtl/>
+        </w:rPr>
+        <w:t>ולכן ההיוריסטיקה לא תעדיף תחנת טעינה ללא צורך</w:t>
+      </w:r>
+      <w:r>
+        <w:rPr>
+          <w:rFonts w:ascii="Cambria Math" w:hAnsi="Cambria Math"/>
+          <w:i/>
+          <w:color w:val="0070C0"/>
+        </w:rPr>
+        <w:t>.</w:t>
+      </w:r>
+    </w:p>
+    <w:p>
+      <w:pPr>
+        <w:spacing w:after="464" w:line="291" w:lineRule="auto"/>
+        <w:ind w:right="166"/>
+        <w:jc w:val="left"/>
+        <w:rPr>
+          <w:rFonts w:ascii="Cambria Math" w:hAnsi="Cambria Math" w:hint="cs"/>
+          <w:i/>
+          <w:color w:val="0070C0"/>
+          <w:rtl/>
+        </w:rPr>
+      </w:pPr>
+      <w:r>
+        <w:rPr>
+          <w:rFonts w:ascii="Cambria Math" w:hAnsi="Cambria Math"/>
+          <w:i/>
+          <w:color w:val="0070C0"/>
+          <w:rtl/>
+        </w:rPr>
+        <w:t xml:space="preserve">האיבר </w:t>
+      </w:r>
+      <m:oMath>
+        <m:r>
+          <w:rPr>
+            <w:rFonts w:ascii="Cambria Math" w:hAnsi="Cambria Math"/>
+            <w:color w:val="0070C0"/>
+          </w:rPr>
+          <m:t>PackageUtility</m:t>
+        </m:r>
+      </m:oMath>
+      <w:r>
+        <w:rPr>
+          <w:rFonts w:ascii="Cambria Math" w:hAnsi="Cambria Math" w:hint="cs"/>
+          <w:i/>
+          <w:color w:val="0070C0"/>
+          <w:rtl/>
+        </w:rPr>
+        <w:t xml:space="preserve"> </w:t>
+      </w:r>
+      <w:r>
+        <w:rPr>
+          <w:rFonts w:ascii="Cambria Math" w:hAnsi="Cambria Math"/>
+          <w:i/>
+          <w:color w:val="0070C0"/>
+          <w:rtl/>
+        </w:rPr>
+        <w:t>משלב את ערך החבילה ואת ההתקדמות במסלול</w:t>
+      </w:r>
+      <w:r>
+        <w:rPr>
+          <w:rFonts w:ascii="Cambria Math" w:hAnsi="Cambria Math" w:hint="cs"/>
+          <w:i/>
+          <w:color w:val="0070C0"/>
+          <w:rtl/>
+        </w:rPr>
+        <w:t>,</w:t>
+      </w:r>
+      <w:r>
+        <w:rPr>
+          <w:rFonts w:ascii="Cambria Math" w:hAnsi="Cambria Math"/>
+          <w:i/>
+          <w:color w:val="0070C0"/>
+          <w:rtl/>
+        </w:rPr>
+        <w:t xml:space="preserve"> והאיבר </w:t>
+      </w:r>
+      <m:oMath>
+        <m:r>
+          <w:rPr>
+            <w:rFonts w:ascii="Cambria Math" w:hAnsi="Cambria Math"/>
+            <w:color w:val="0070C0"/>
+          </w:rPr>
+          <m:t>EnergyRisk</m:t>
+        </m:r>
+      </m:oMath>
+      <w:r>
+        <w:rPr>
+          <w:rFonts w:ascii="Cambria Math" w:hAnsi="Cambria Math" w:hint="cs"/>
+          <w:i/>
+          <w:color w:val="0070C0"/>
+          <w:rtl/>
+        </w:rPr>
+        <w:t xml:space="preserve"> </w:t>
+      </w:r>
+      <w:r>
+        <w:rPr>
+          <w:rFonts w:ascii="Cambria Math" w:hAnsi="Cambria Math"/>
+          <w:i/>
+          <w:color w:val="0070C0"/>
+          <w:rtl/>
+        </w:rPr>
+        <w:t xml:space="preserve">מתחשב ביכולת האנרגטית להשלים את המסלול או להתקרב </w:t>
+      </w:r>
+      <w:r>
+        <w:rPr>
+          <w:rFonts w:ascii="Cambria Math" w:hAnsi="Cambria Math" w:hint="cs"/>
+          <w:i/>
+          <w:color w:val="0070C0"/>
+          <w:rtl/>
+        </w:rPr>
+        <w:t>לתחנת טעינה</w:t>
+      </w:r>
+      <w:r>
+        <w:rPr>
+          <w:rFonts w:ascii="Cambria Math" w:hAnsi="Cambria Math"/>
+          <w:i/>
+          <w:color w:val="0070C0"/>
+          <w:rtl/>
+        </w:rPr>
+        <w:t xml:space="preserve"> </w:t>
+      </w:r>
+      <w:r>
+        <w:rPr>
+          <w:rFonts w:ascii="Cambria Math" w:hAnsi="Cambria Math" w:hint="cs"/>
+          <w:i/>
+          <w:color w:val="0070C0"/>
+          <w:rtl/>
+        </w:rPr>
+        <w:t>במידת</w:t>
+      </w:r>
+      <w:r>
+        <w:rPr>
+          <w:rFonts w:ascii="Cambria Math" w:hAnsi="Cambria Math"/>
+          <w:i/>
+          <w:color w:val="0070C0"/>
+          <w:rtl/>
+        </w:rPr>
+        <w:t xml:space="preserve"> הצורך. לכן ההיוריסטיקה כוללת לפחות שלושה מאפייני סביבה: ערך חבילה, מרחק/התקדמות במסלול, </w:t>
+      </w:r>
+      <w:r>
+        <w:rPr>
+          <w:rFonts w:ascii="Cambria Math" w:hAnsi="Cambria Math"/>
+          <w:i/>
+          <w:color w:val="0070C0"/>
+          <w:rtl/>
+        </w:rPr>
+        <w:t>מצב הסוללה, ורלוונטיות של תחנת טעינה כאשר אין מספיק סוללה</w:t>
+      </w:r>
+      <w:r>
+        <w:rPr>
+          <w:rFonts w:ascii="Cambria Math" w:hAnsi="Cambria Math"/>
+          <w:i/>
+          <w:color w:val="0070C0"/>
+          <w:rtl/>
+        </w:rPr>
+        <w:t>. בנוסף קיים איבר קטן של הפרש ניקוד, שמשפיע בעיקר לאחר פעולות שמשנות קרדיט כמו הורדת חבילה או טעינה</w:t>
+      </w:r>
+      <w:r>
+        <w:rPr>
+          <w:rFonts w:ascii="Cambria Math" w:hAnsi="Cambria Math"/>
+          <w:i/>
+          <w:color w:val="0070C0"/>
+        </w:rPr>
+        <w:t>.</w:t>
+      </w:r>
+    </w:p>
+    <w:p>
+      <w:pPr>
         <w:pStyle w:val="ListParagraph"/>
         <w:numPr>
           <w:ilvl w:val="0"/>
@@ -6238,7 +8142,6 @@
         <w:rPr>
           <w:rFonts w:asciiTheme="minorBidi" w:hAnsiTheme="minorBidi" w:cstheme="minorBidi"/>
           <w:sz w:val="24"/>
-          <w:lang/>
         </w:rPr>
       </w:pPr>
       <w:r>
@@ -6280,7 +8183,6 @@
         <w:rPr>
           <w:rFonts w:asciiTheme="minorBidi" w:hAnsiTheme="minorBidi" w:cstheme="minorBidi"/>
           <w:sz w:val="24"/>
-          <w:lang/>
         </w:rPr>
         <w:t>AgentMinimax</w:t>
       </w:r>
@@ -6332,7 +8234,6 @@
         <w:rPr>
           <w:rFonts w:asciiTheme="minorBidi" w:hAnsiTheme="minorBidi" w:cstheme="minorBidi"/>
           <w:sz w:val="24"/>
-          <w:lang/>
         </w:rPr>
         <w:t>submission.py</w:t>
       </w:r>
@@ -6390,7 +8291,6 @@
         <w:rPr>
           <w:rFonts w:asciiTheme="minorBidi" w:hAnsiTheme="minorBidi" w:cstheme="minorBidi"/>
           <w:sz w:val="24"/>
-          <w:lang/>
         </w:rPr>
         <w:t>minimax_decision(env, robot_id, depth, heuristic_fn=None)</w:t>
       </w:r>
@@ -6440,7 +8340,6 @@
         <w:rPr>
           <w:rFonts w:asciiTheme="minorBidi" w:hAnsiTheme="minorBidi" w:cstheme="minorBidi"/>
           <w:sz w:val="24"/>
-          <w:lang/>
         </w:rPr>
         <w:t>heuristic_fn</w:t>
       </w:r>
@@ -6474,7 +8373,6 @@
         <w:rPr>
           <w:rFonts w:asciiTheme="minorBidi" w:hAnsiTheme="minorBidi" w:cstheme="minorBidi"/>
           <w:sz w:val="24"/>
-          <w:lang/>
         </w:rPr>
         <w:t>None</w:t>
       </w:r>
@@ -6508,7 +8406,6 @@
         <w:rPr>
           <w:rFonts w:asciiTheme="minorBidi" w:hAnsiTheme="minorBidi" w:cstheme="minorBidi"/>
           <w:sz w:val="24"/>
-          <w:lang/>
         </w:rPr>
         <w:t>heuristic_fn</w:t>
       </w:r>
@@ -6542,7 +8439,6 @@
         <w:rPr>
           <w:rFonts w:asciiTheme="minorBidi" w:hAnsiTheme="minorBidi" w:cstheme="minorBidi"/>
           <w:sz w:val="24"/>
-          <w:lang/>
         </w:rPr>
         <w:t>None</w:t>
       </w:r>
@@ -6576,7 +8472,6 @@
         <w:rPr>
           <w:rFonts w:asciiTheme="minorBidi" w:hAnsiTheme="minorBidi" w:cstheme="minorBidi"/>
           <w:sz w:val="24"/>
-          <w:lang/>
         </w:rPr>
         <w:t>smart_heuristic</w:t>
       </w:r>
@@ -6641,7 +8536,6 @@
         <w:rPr>
           <w:rFonts w:asciiTheme="minorBidi" w:hAnsiTheme="minorBidi" w:cstheme="minorBidi"/>
           <w:sz w:val="24"/>
-          <w:lang/>
         </w:rPr>
         <w:t>TIE_BREAKING_ORDER</w:t>
       </w:r>
@@ -6706,7 +8600,6 @@
         <w:rPr>
           <w:rFonts w:asciiTheme="minorBidi" w:hAnsiTheme="minorBidi" w:cstheme="minorBidi"/>
           <w:sz w:val="24"/>
-          <w:lang/>
         </w:rPr>
         <w:t>AgentMinimax</w:t>
       </w:r>
@@ -6758,7 +8651,6 @@
         <w:rPr>
           <w:rFonts w:asciiTheme="minorBidi" w:hAnsiTheme="minorBidi" w:cstheme="minorBidi"/>
           <w:sz w:val="24"/>
-          <w:lang/>
         </w:rPr>
         <w:t>time_limit</w:t>
       </w:r>
@@ -8625,24 +10517,7 @@
           <w:sz w:val="24"/>
           <w:rtl/>
         </w:rPr>
-        <w:t xml:space="preserve"> מקבלות משקל 4 כאשר הן חוקיות, וכל פעולה חוקית אחרת מקבלת משקל 1. ההסתברויות מתקבלות מנרמול המשקלים על פני הפעולות החוקיות בלבד.</w:t>
-      </w:r>
-      <w:r>
-        <w:rPr>
-          <w:rFonts w:asciiTheme="minorBidi" w:hAnsiTheme="minorBidi" w:cstheme="minorBidi"/>
-          <w:sz w:val="24"/>
-          <w:rtl/>
-          <w:lang/>
-        </w:rPr>
-        <w:t xml:space="preserve"> </w:t>
-      </w:r>
-      <w:r>
-        <w:rPr>
-          <w:rFonts w:asciiTheme="minorBidi" w:hAnsiTheme="minorBidi" w:cstheme="minorBidi"/>
-          <w:sz w:val="24"/>
-          <w:rtl/>
-        </w:rPr>
-        <w:t xml:space="preserve">ממשו אלגוריתם </w:t>
+        <w:t xml:space="preserve"> מקבלות משקל 4 כאשר הן חוקיות, וכל פעולה חוקית אחרת מקבלת משקל 1. ההסתברויות מתקבלות מנרמול המשקלים על פני הפעולות החוקיות בלבד. ממשו אלגוריתם </w:t>
       </w:r>
       <w:r>
         <w:rPr>
@@ -8666,15 +10541,7 @@
           <w:sz w:val="24"/>
           <w:lang w:bidi="ar-SA"/>
         </w:rPr>
-        <w:t>expectimax_decision(env, robot_id, depth, heuristic_fn=None</w:t>
-      </w:r>
-      <w:r>
-        <w:rPr>
-          <w:rFonts w:asciiTheme="minorBidi" w:hAnsiTheme="minorBidi" w:cstheme="minorBidi"/>
-          <w:sz w:val="24"/>
-          <w:lang w:bidi="ar-SA"/>
-        </w:rPr>
-        <w:t>)</w:t>
+        <w:t>expectimax_decision(env, robot_id, depth, heuristic_fn=None)</w:t>
       </w:r>
       <w:r>
         <w:rPr>
@@ -11794,16 +13661,6 @@
                         </w:rPr>
                         <m:t>aᵢ</m:t>
                       </m:r>
-                      <m:ctrlPr>
-                        <w:rPr>
-                          <w:rFonts w:ascii="Cambria Math" w:hAnsi="Cambria Math" w:cstheme="minorBidi"/>
-                          <w:i/>
-                          <w:iCs/>
-                          <w:color w:val="auto"/>
-                          <w:sz w:val="24"/>
-                          <w:lang w:bidi="ar-SA"/>
-                        </w:rPr>
-                      </m:ctrlPr>
                     </m:e>
                   </m:d>
                 </m:den>
@@ -14311,10 +16168,116 @@
         <w:t>יוכלו להיבחר בצורה מדגמית לבחינה קצרה בעל פה על הגיליון והקוד שהגישו.</w:t>
       </w:r>
     </w:p>
+    <w:p>
+      <w:pPr>
+        <w:pBdr>
+          <w:top w:val="nil"/>
+          <w:left w:val="nil"/>
+          <w:bottom w:val="nil"/>
+          <w:right w:val="nil"/>
+          <w:between w:val="nil"/>
+        </w:pBdr>
+        <w:spacing w:after="0" w:line="360" w:lineRule="auto"/>
+        <w:jc w:val="left"/>
+        <w:rPr>
+          <w:rFonts w:eastAsia="David"/>
+          <w:color w:val="auto"/>
+          <w:kern w:val="0"/>
+          <w:sz w:val="24"/>
+          <w:lang w:bidi="he"/>
+          <w14:ligatures w14:val="none"/>
+        </w:rPr>
+      </w:pPr>
+    </w:p>
+    <w:p>
+      <w:pPr>
+        <w:pBdr>
+          <w:top w:val="nil"/>
+          <w:left w:val="nil"/>
+          <w:bottom w:val="nil"/>
+          <w:right w:val="nil"/>
+          <w:between w:val="nil"/>
+        </w:pBdr>
+        <w:spacing w:after="0" w:line="360" w:lineRule="auto"/>
+        <w:jc w:val="left"/>
+        <w:rPr>
+          <w:rFonts w:eastAsia="David"/>
+          <w:color w:val="auto"/>
+          <w:kern w:val="0"/>
+          <w:sz w:val="24"/>
+          <w:lang w:bidi="he"/>
+          <w14:ligatures w14:val="none"/>
+        </w:rPr>
+      </w:pPr>
+    </w:p>
+    <w:p>
+      <w:pPr>
+        <w:pBdr>
+          <w:top w:val="nil"/>
+          <w:left w:val="nil"/>
+          <w:bottom w:val="nil"/>
+          <w:right w:val="nil"/>
+          <w:between w:val="nil"/>
+        </w:pBdr>
+        <w:spacing w:after="0" w:line="360" w:lineRule="auto"/>
+        <w:jc w:val="left"/>
+        <w:rPr>
+          <w:rFonts w:eastAsia="David"/>
+          <w:color w:val="auto"/>
+          <w:kern w:val="0"/>
+          <w:sz w:val="24"/>
+          <w14:ligatures w14:val="none"/>
+        </w:rPr>
+      </w:pPr>
+      <w:r>
+        <w:rPr>
+          <w:rFonts w:eastAsia="David" w:hint="cs"/>
+          <w:color w:val="auto"/>
+          <w:kern w:val="0"/>
+          <w:sz w:val="24"/>
+          <w:rtl/>
+          <w14:ligatures w14:val="none"/>
+        </w:rPr>
+        <w:t xml:space="preserve">חלק א שאלה 2 - </w:t>
+      </w:r>
+      <w:hyperlink r:id="rId19" w:history="1">
+        <w:r>
+          <w:rPr>
+            <w:rStyle w:val="Hyperlink"/>
+            <w:rFonts w:eastAsia="David"/>
+            <w:kern w:val="0"/>
+            <w:sz w:val="24"/>
+            <w14:ligatures w14:val="none"/>
+          </w:rPr>
+          <w:t>https://chatgpt.com/share/6a395dd8-f724-83ed-a3e2-0ffcd62c0686</w:t>
+        </w:r>
+      </w:hyperlink>
+    </w:p>
+    <w:p>
+      <w:pPr>
+        <w:pBdr>
+          <w:top w:val="nil"/>
+          <w:left w:val="nil"/>
+          <w:bottom w:val="nil"/>
+          <w:right w:val="nil"/>
+          <w:between w:val="nil"/>
+        </w:pBdr>
+        <w:spacing w:after="0" w:line="360" w:lineRule="auto"/>
+        <w:jc w:val="left"/>
+        <w:rPr>
+          <w:rFonts w:eastAsia="David" w:hint="cs"/>
+          <w:color w:val="auto"/>
+          <w:kern w:val="0"/>
+          <w:sz w:val="24"/>
+          <w:rtl/>
+          <w14:ligatures w14:val="none"/>
+        </w:rPr>
+      </w:pPr>
+    </w:p>
     <w:sectPr>
-      <w:headerReference w:type="even" r:id="rId19"/>
-      <w:headerReference w:type="default" r:id="rId20"/>
-      <w:headerReference w:type="first" r:id="rId21"/>
+      <w:headerReference w:type="even" r:id="rId20"/>
+      <w:headerReference w:type="default" r:id="rId21"/>
+      <w:headerReference w:type="first" r:id="rId22"/>
       <w:pgSz w:w="11920" w:h="16840"/>
       <w:pgMar w:top="1440" w:right="1440" w:bottom="1440" w:left="1440" w:header="720" w:footer="720" w:gutter="0"/>
       <w:cols w:space="720"/>
@@ -18838,7 +20801,6 @@
   <w:style w:type="character" w:default="1" w:styleId="DefaultParagraphFont">
     <w:name w:val="Default Paragraph Font"/>
     <w:uiPriority w:val="1"/>
-    <w:semiHidden/>
     <w:unhideWhenUsed/>
   </w:style>
   <w:style w:type="table" w:default="1" w:styleId="TableNormal">
@@ -19064,6 +21026,18 @@
     <w:rsid w:val="005A142C"/>
     <w:rPr>
       <w:color w:val="666666"/>
+    </w:rPr>
+  </w:style>
+  <w:style w:type="paragraph" w:styleId="NormalWeb">
+    <w:name w:val="Normal (Web)"/>
+    <w:basedOn w:val="Normal"/>
+    <w:uiPriority w:val="99"/>
+    <w:semiHidden/>
+    <w:unhideWhenUsed/>
+    <w:rsid w:val="009B5668"/>
+    <w:rPr>
+      <w:rFonts w:ascii="Times New Roman" w:hAnsi="Times New Roman" w:cs="Times New Roman"/>
+      <w:sz w:val="24"/>
     </w:rPr>
   </w:style>
 </w:styles>

</xml_diff>

<commit_message>
added the min max rb, agent minmax
</commit_message>
<xml_diff>
--- a/HW2_IntroToAI.docx
+++ b/HW2_IntroToAI.docx
@@ -5914,7 +5914,7 @@
         <w:ind w:right="166"/>
         <w:jc w:val="left"/>
         <w:rPr>
-          <w:rFonts w:ascii="Cambria Math" w:hAnsi="Cambria Math" w:hint="cs"/>
+          <w:rFonts w:ascii="Cambria Math" w:hAnsi="Cambria Math"/>
           <w:i/>
           <w:color w:val="0070C0"/>
           <w:rtl/>
@@ -6090,21 +6090,7 @@
               <w:rFonts w:ascii="Cambria Math" w:hAnsi="Cambria Math"/>
               <w:color w:val="0070C0"/>
             </w:rPr>
-            <m:t>=</m:t>
-          </m:r>
-          <m:r>
-            <w:rPr>
-              <w:rFonts w:ascii="Cambria Math" w:hAnsi="Cambria Math"/>
-              <w:color w:val="0070C0"/>
-            </w:rPr>
-            <m:t>=</m:t>
-          </m:r>
-          <m:r>
-            <w:rPr>
-              <w:rFonts w:ascii="Cambria Math" w:hAnsi="Cambria Math"/>
-              <w:color w:val="0070C0"/>
-            </w:rPr>
-            <m:t>Reward</m:t>
+            <m:t>==Reward</m:t>
           </m:r>
           <m:d>
             <m:dPr>
@@ -6399,21 +6385,7 @@
               <w:rFonts w:ascii="Cambria Math" w:hAnsi="Cambria Math"/>
               <w:color w:val="0070C0"/>
             </w:rPr>
-            <m:t>RouteDist</m:t>
-          </m:r>
-          <m:r>
-            <w:rPr>
-              <w:rFonts w:ascii="Cambria Math" w:hAnsi="Cambria Math"/>
-              <w:color w:val="0070C0"/>
-            </w:rPr>
-            <m:t>(s,r</m:t>
-          </m:r>
-          <m:r>
-            <w:rPr>
-              <w:rFonts w:ascii="Cambria Math" w:hAnsi="Cambria Math"/>
-              <w:color w:val="0070C0"/>
-            </w:rPr>
-            <m:t>,</m:t>
+            <m:t>RouteDist(s,r,</m:t>
           </m:r>
           <m:sSup>
             <m:sSupPr>
@@ -6449,14 +6421,7 @@
               <w:rFonts w:ascii="Cambria Math" w:hAnsi="Cambria Math"/>
               <w:color w:val="0070C0"/>
             </w:rPr>
-            <m:t>)</m:t>
-          </m:r>
-          <m:r>
-            <w:rPr>
-              <w:rFonts w:ascii="Cambria Math" w:hAnsi="Cambria Math"/>
-              <w:color w:val="0070C0"/>
-            </w:rPr>
-            <m:t>=Manhattan(position(r),destination(</m:t>
+            <m:t>)=Manhattan(position(r),destination(</m:t>
           </m:r>
           <m:sSup>
             <m:sSupPr>
@@ -6534,21 +6499,7 @@
               <w:rFonts w:ascii="Cambria Math" w:hAnsi="Cambria Math"/>
               <w:color w:val="0070C0"/>
             </w:rPr>
-            <m:t>RouteDist</m:t>
-          </m:r>
-          <m:r>
-            <w:rPr>
-              <w:rFonts w:ascii="Cambria Math" w:hAnsi="Cambria Math"/>
-              <w:color w:val="0070C0"/>
-            </w:rPr>
-            <m:t>(s,r</m:t>
-          </m:r>
-          <m:r>
-            <w:rPr>
-              <w:rFonts w:ascii="Cambria Math" w:hAnsi="Cambria Math"/>
-              <w:color w:val="0070C0"/>
-            </w:rPr>
-            <m:t>,</m:t>
+            <m:t>RouteDist(s,r,</m:t>
           </m:r>
           <m:sSup>
             <m:sSupPr>
@@ -6695,9 +6646,11 @@
             <m:t>))</m:t>
           </m:r>
           <m:r>
+            <m:rPr>
+              <m:sty m:val="p"/>
+            </m:rPr>
             <w:rPr>
               <w:rFonts w:ascii="Cambria Math" w:hAnsi="Cambria Math"/>
-              <w:i/>
               <w:color w:val="0070C0"/>
             </w:rPr>
             <w:br/>
@@ -6846,7 +6799,7 @@
         <w:ind w:right="166"/>
         <w:jc w:val="left"/>
         <w:rPr>
-          <w:rFonts w:ascii="Cambria Math" w:hAnsi="Cambria Math" w:hint="cs"/>
+          <w:rFonts w:ascii="Cambria Math" w:hAnsi="Cambria Math"/>
           <w:i/>
           <w:color w:val="0070C0"/>
           <w:rtl/>
@@ -6962,7 +6915,7 @@
         <w:ind w:right="166"/>
         <w:jc w:val="left"/>
         <w:rPr>
-          <w:rFonts w:ascii="Cambria Math" w:hAnsi="Cambria Math" w:hint="cs"/>
+          <w:rFonts w:ascii="Cambria Math" w:hAnsi="Cambria Math"/>
           <w:i/>
           <w:color w:val="0070C0"/>
           <w:rtl/>
@@ -7035,9 +6988,11 @@
             <m:t>Manhattan(position(r),c)</m:t>
           </m:r>
           <m:r>
+            <m:rPr>
+              <m:sty m:val="p"/>
+            </m:rPr>
             <w:rPr>
               <w:rFonts w:ascii="Cambria Math" w:hAnsi="Cambria Math"/>
-              <w:i/>
               <w:color w:val="0070C0"/>
             </w:rPr>
             <w:br/>
@@ -7362,7 +7317,7 @@
         <w:ind w:right="166"/>
         <w:jc w:val="left"/>
         <w:rPr>
-          <w:rFonts w:ascii="Cambria Math" w:hAnsi="Cambria Math" w:hint="cs"/>
+          <w:rFonts w:ascii="Cambria Math" w:hAnsi="Cambria Math"/>
           <w:i/>
           <w:color w:val="0070C0"/>
           <w:rtl/>
@@ -7705,6 +7660,172 @@
         <w:ind w:left="360" w:right="166"/>
         <w:jc w:val="left"/>
         <w:rPr>
+          <w:color w:val="0070C0"/>
+          <w:sz w:val="26"/>
+          <w:szCs w:val="26"/>
+          <w:rtl/>
+        </w:rPr>
+      </w:pPr>
+      <w:r>
+        <w:rPr>
+          <w:color w:val="0070C0"/>
+          <w:sz w:val="26"/>
+          <w:szCs w:val="26"/>
+          <w:rtl/>
+        </w:rPr>
+        <w:t>מאפיין שהיוריסטיקה חייבת לקחת בחשבון הוא המרחק למטרה הנוכחית של הרובוט: אם הרובוט לא סוחב חבילה</w:t>
+      </w:r>
+      <w:r>
+        <w:rPr>
+          <w:rFonts w:hint="cs"/>
+          <w:color w:val="0070C0"/>
+          <w:sz w:val="26"/>
+          <w:szCs w:val="26"/>
+          <w:rtl/>
+        </w:rPr>
+        <w:t xml:space="preserve"> </w:t>
+      </w:r>
+      <w:r>
+        <w:rPr>
+          <w:color w:val="0070C0"/>
+          <w:sz w:val="26"/>
+          <w:szCs w:val="26"/>
+          <w:rtl/>
+        </w:rPr>
+        <w:t>–</w:t>
+      </w:r>
+      <w:r>
+        <w:rPr>
+          <w:rFonts w:hint="cs"/>
+          <w:color w:val="0070C0"/>
+          <w:sz w:val="26"/>
+          <w:szCs w:val="26"/>
+          <w:rtl/>
+        </w:rPr>
+        <w:t xml:space="preserve"> </w:t>
+      </w:r>
+      <w:r>
+        <w:rPr>
+          <w:color w:val="0070C0"/>
+          <w:sz w:val="26"/>
+          <w:szCs w:val="26"/>
+          <w:rtl/>
+        </w:rPr>
+        <w:t xml:space="preserve">המרחק לחבילה רלוונטית, ואם הוא סוחב חבילה </w:t>
+      </w:r>
+      <w:r>
+        <w:rPr>
+          <w:color w:val="0070C0"/>
+          <w:sz w:val="26"/>
+          <w:szCs w:val="26"/>
+          <w:rtl/>
+        </w:rPr>
+        <w:t>–</w:t>
+      </w:r>
+      <w:r>
+        <w:rPr>
+          <w:color w:val="0070C0"/>
+          <w:sz w:val="26"/>
+          <w:szCs w:val="26"/>
+          <w:rtl/>
+        </w:rPr>
+        <w:t xml:space="preserve"> המרחק ליעד המסירה שלה.</w:t>
+      </w:r>
+    </w:p>
+    <w:p>
+      <w:pPr>
+        <w:spacing w:after="10" w:line="291" w:lineRule="auto"/>
+        <w:ind w:left="360" w:right="166"/>
+        <w:jc w:val="left"/>
+        <w:rPr>
+          <w:color w:val="0070C0"/>
+          <w:sz w:val="26"/>
+          <w:szCs w:val="26"/>
+        </w:rPr>
+      </w:pPr>
+      <w:r>
+        <w:rPr>
+          <w:color w:val="0070C0"/>
+          <w:sz w:val="26"/>
+          <w:szCs w:val="26"/>
+          <w:rtl/>
+        </w:rPr>
+        <w:t xml:space="preserve">המאפיין הזה הכרחי כי הסוכן </w:t>
+      </w:r>
+      <w:proofErr w:type="spellStart"/>
+      <w:r>
+        <w:rPr>
+          <w:color w:val="0070C0"/>
+          <w:sz w:val="26"/>
+          <w:szCs w:val="26"/>
+        </w:rPr>
+        <w:t>ImprovedGreedy</w:t>
+      </w:r>
+      <w:proofErr w:type="spellEnd"/>
+      <w:r>
+        <w:rPr>
+          <w:color w:val="0070C0"/>
+          <w:sz w:val="26"/>
+          <w:szCs w:val="26"/>
+          <w:rtl/>
+        </w:rPr>
+        <w:t xml:space="preserve"> בוחר את המצב הבא לפי ערך היוריסטי</w:t>
+      </w:r>
+      <w:r>
+        <w:rPr>
+          <w:rFonts w:hint="cs"/>
+          <w:color w:val="0070C0"/>
+          <w:sz w:val="26"/>
+          <w:szCs w:val="26"/>
+          <w:rtl/>
+        </w:rPr>
+        <w:t>קה</w:t>
+      </w:r>
+      <w:r>
+        <w:rPr>
+          <w:color w:val="0070C0"/>
+          <w:sz w:val="26"/>
+          <w:szCs w:val="26"/>
+          <w:rtl/>
+        </w:rPr>
+        <w:t xml:space="preserve">, ולכן בלי התחשבות במרחק למטרה הוא לא יידע </w:t>
+      </w:r>
+      <w:r>
+        <w:rPr>
+          <w:rFonts w:hint="cs"/>
+          <w:color w:val="0070C0"/>
+          <w:sz w:val="26"/>
+          <w:szCs w:val="26"/>
+          <w:rtl/>
+        </w:rPr>
+        <w:t>לתעדף</w:t>
+      </w:r>
+      <w:r>
+        <w:rPr>
+          <w:color w:val="0070C0"/>
+          <w:sz w:val="26"/>
+          <w:szCs w:val="26"/>
+          <w:rtl/>
+        </w:rPr>
+        <w:t xml:space="preserve"> צעדים שמקדמים אותו לאיסוף או למסירה של חבילות</w:t>
+      </w:r>
+      <w:r>
+        <w:rPr>
+          <w:rFonts w:hint="cs"/>
+          <w:color w:val="0070C0"/>
+          <w:sz w:val="26"/>
+          <w:szCs w:val="26"/>
+          <w:rtl/>
+        </w:rPr>
+        <w:t>.</w:t>
+      </w:r>
+    </w:p>
+    <w:p>
+      <w:pPr>
+        <w:spacing w:after="10" w:line="291" w:lineRule="auto"/>
+        <w:ind w:left="360" w:right="166"/>
+        <w:jc w:val="left"/>
+        <w:rPr>
           <w:color w:val="4C94D8" w:themeColor="text2" w:themeTint="80"/>
           <w:rtl/>
         </w:rPr>
@@ -7875,16 +7996,82 @@
     </w:p>
     <w:p>
       <w:pPr>
+        <w:spacing w:after="426" w:line="291" w:lineRule="auto"/>
+        <w:ind w:left="360" w:right="52"/>
+        <w:jc w:val="left"/>
+        <w:rPr>
+          <w:color w:val="0070C0"/>
+          <w:sz w:val="24"/>
+        </w:rPr>
+      </w:pPr>
+      <w:r>
+        <w:rPr>
+          <w:color w:val="0070C0"/>
+          <w:sz w:val="24"/>
+          <w:rtl/>
+        </w:rPr>
+        <w:t>במינימקס מוגבל משאבים יש טרייד</w:t>
+      </w:r>
+      <w:r>
+        <w:rPr>
+          <w:color w:val="0070C0"/>
+          <w:sz w:val="24"/>
+        </w:rPr>
+        <w:t xml:space="preserve"> </w:t>
+      </w:r>
+      <w:r>
+        <w:rPr>
+          <w:color w:val="0070C0"/>
+          <w:sz w:val="24"/>
+          <w:rtl/>
+        </w:rPr>
+        <w:t>אוף בין זמן חישוב של ההיוריסטיקה לבין איכות ההערכה שלה. היוריסטיקה קלה לחישוב מאפשרת להרחיב יותר מצבים בזמן הנתון, ולכן ניתן להגיע לעומק חיפוש גדול יותר או לבדוק יותר מהלכים. החיסרון הוא שהיא פחות מיודעת, ולכן הערכת המצבים בקצה החיפוש עלולה להיות פחות מדויקת ולגרום לבחירת מהלך פחות טוב.</w:t>
+      </w:r>
+      <w:r>
+        <w:rPr>
+          <w:color w:val="0070C0"/>
+          <w:sz w:val="24"/>
+        </w:rPr>
+        <w:br/>
+      </w:r>
+      <w:r>
+        <w:rPr>
+          <w:color w:val="0070C0"/>
+          <w:sz w:val="24"/>
+          <w:rtl/>
+        </w:rPr>
+        <w:t>לעומת זאת, היוריסטיקה קשה לחישוב יכולה לתת הערכה מדויקת יותר של מצבים לא</w:t>
+      </w:r>
+      <w:r>
+        <w:rPr>
+          <w:rFonts w:hint="cs"/>
+          <w:color w:val="0070C0"/>
+          <w:sz w:val="24"/>
+          <w:rtl/>
+        </w:rPr>
+        <w:t xml:space="preserve"> </w:t>
+      </w:r>
+      <w:r>
+        <w:rPr>
+          <w:color w:val="0070C0"/>
+          <w:sz w:val="24"/>
+          <w:rtl/>
+        </w:rPr>
+        <w:t xml:space="preserve">סופיים, ולכן לשפר את איכות ההחלטה כאשר מגיעים לעומק החיתוך. החיסרון הוא שהיא צורכת יותר זמן בכל עלה, ולכן באותו משאב זמן האלגוריתם יספיק לבדוק פחות מצבים או להגיע לעומק קטן יותר. </w:t>
+      </w:r>
+    </w:p>
+    <w:p>
+      <w:pPr>
+        <w:pStyle w:val="ListParagraph"/>
         <w:numPr>
           <w:ilvl w:val="0"/>
           <w:numId w:val="14"/>
         </w:numPr>
         <w:spacing w:after="426" w:line="291" w:lineRule="auto"/>
-        <w:ind w:right="244"/>
-        <w:jc w:val="left"/>
-        <w:rPr>
-          <w:sz w:val="24"/>
-          <w:rtl/>
+        <w:ind w:right="52"/>
+        <w:jc w:val="left"/>
+        <w:rPr>
+          <w:sz w:val="24"/>
         </w:rPr>
       </w:pPr>
       <w:r>
@@ -8072,6 +8259,174 @@
         </w:rPr>
         <w:t>להיות?</w:t>
       </w:r>
+    </w:p>
+    <w:p>
+      <w:pPr>
+        <w:pStyle w:val="ListParagraph"/>
+        <w:spacing w:after="426" w:line="291" w:lineRule="auto"/>
+        <w:ind w:right="52"/>
+        <w:jc w:val="left"/>
+        <w:rPr>
+          <w:color w:val="0070C0"/>
+          <w:sz w:val="24"/>
+        </w:rPr>
+      </w:pPr>
+      <w:r>
+        <w:rPr>
+          <w:color w:val="0070C0"/>
+          <w:sz w:val="24"/>
+          <w:rtl/>
+        </w:rPr>
+        <w:t>ב</w:t>
+      </w:r>
+      <w:r>
+        <w:rPr>
+          <w:rFonts w:hint="cs"/>
+          <w:color w:val="0070C0"/>
+          <w:sz w:val="24"/>
+          <w:rtl/>
+        </w:rPr>
+        <w:t xml:space="preserve">- </w:t>
+      </w:r>
+      <w:r>
+        <w:rPr>
+          <w:color w:val="0070C0"/>
+          <w:sz w:val="24"/>
+        </w:rPr>
+        <w:t>m</w:t>
+      </w:r>
+      <w:r>
+        <w:rPr>
+          <w:color w:val="0070C0"/>
+          <w:sz w:val="24"/>
+        </w:rPr>
+        <w:t>inimax</w:t>
+      </w:r>
+      <w:r>
+        <w:rPr>
+          <w:color w:val="0070C0"/>
+          <w:sz w:val="24"/>
+          <w:rtl/>
+        </w:rPr>
+        <w:t>, אם קיים מהלך שמוביל לניצחון בצעד אחד והמצב הזה נבדק, הסוכן חייב לבחור בו</w:t>
+      </w:r>
+      <w:r>
+        <w:rPr>
+          <w:rFonts w:hint="cs"/>
+          <w:color w:val="0070C0"/>
+          <w:sz w:val="24"/>
+          <w:rtl/>
+        </w:rPr>
+        <w:t>,</w:t>
+      </w:r>
+      <w:r>
+        <w:rPr>
+          <w:color w:val="0070C0"/>
+          <w:sz w:val="24"/>
+          <w:rtl/>
+        </w:rPr>
+        <w:t xml:space="preserve"> אחרת יש באג. אבל ב</w:t>
+      </w:r>
+      <w:r>
+        <w:rPr>
+          <w:rFonts w:hint="cs"/>
+          <w:color w:val="0070C0"/>
+          <w:sz w:val="24"/>
+          <w:rtl/>
+        </w:rPr>
+        <w:t>-</w:t>
+      </w:r>
+      <w:r>
+        <w:rPr>
+          <w:color w:val="0070C0"/>
+          <w:sz w:val="24"/>
+        </w:rPr>
+        <w:t>RB-Minimax</w:t>
+      </w:r>
+      <w:r>
+        <w:rPr>
+          <w:color w:val="0070C0"/>
+          <w:sz w:val="24"/>
+          <w:rtl/>
+        </w:rPr>
+        <w:t xml:space="preserve"> לא בהכרח מדובר בבאג באלגוריתם: האלגוריתם משתמש בפונקציית הערכה </w:t>
+      </w:r>
+      <w:r>
+        <w:rPr>
+          <w:color w:val="0070C0"/>
+          <w:sz w:val="24"/>
+        </w:rPr>
+        <w:t>h</w:t>
+      </w:r>
+      <w:r>
+        <w:rPr>
+          <w:color w:val="0070C0"/>
+          <w:sz w:val="24"/>
+          <w:rtl/>
+        </w:rPr>
+        <w:t xml:space="preserve"> במצבים סופיים או בעומק החיתוך, ולכן אם </w:t>
+      </w:r>
+      <w:r>
+        <w:rPr>
+          <w:color w:val="0070C0"/>
+          <w:sz w:val="24"/>
+        </w:rPr>
+        <w:t>h</w:t>
+      </w:r>
+      <w:r>
+        <w:rPr>
+          <w:color w:val="0070C0"/>
+          <w:sz w:val="24"/>
+          <w:rtl/>
+        </w:rPr>
+        <w:t xml:space="preserve"> לא נותנת למצב ניצחון ערך </w:t>
+      </w:r>
+      <w:r>
+        <w:rPr>
+          <w:rFonts w:hint="cs"/>
+          <w:color w:val="0070C0"/>
+          <w:sz w:val="24"/>
+          <w:rtl/>
+        </w:rPr>
+        <w:t>גבוה</w:t>
+      </w:r>
+      <w:r>
+        <w:rPr>
+          <w:color w:val="0070C0"/>
+          <w:sz w:val="24"/>
+          <w:rtl/>
+        </w:rPr>
+        <w:t xml:space="preserve"> מספיק, ייתכן שמהלך אחר יקבל ערך גבוה יותר. לכן צריך לוודא שמצבי ניצחון מקבלים ערך גבוה יותר מכל ערך היוריסטי של מצב לא</w:t>
+      </w:r>
+      <w:r>
+        <w:rPr>
+          <w:rFonts w:hint="cs"/>
+          <w:color w:val="0070C0"/>
+          <w:sz w:val="24"/>
+          <w:rtl/>
+        </w:rPr>
+        <w:t xml:space="preserve"> </w:t>
+      </w:r>
+      <w:r>
+        <w:rPr>
+          <w:color w:val="0070C0"/>
+          <w:sz w:val="24"/>
+          <w:rtl/>
+        </w:rPr>
+        <w:t>סופי.</w:t>
+      </w:r>
+    </w:p>
+    <w:p>
+      <w:pPr>
+        <w:pStyle w:val="ListParagraph"/>
+        <w:spacing w:after="426" w:line="291" w:lineRule="auto"/>
+        <w:ind w:right="52"/>
+        <w:jc w:val="left"/>
+        <w:rPr>
+          <w:sz w:val="24"/>
+          <w:rtl/>
+        </w:rPr>
+      </w:pPr>
     </w:p>
     <w:p>
       <w:pPr>
@@ -8123,6 +8478,150 @@
         <w:ind w:right="244"/>
         <w:jc w:val="left"/>
         <w:rPr>
+          <w:color w:val="0070C0"/>
+          <w:sz w:val="24"/>
+        </w:rPr>
+      </w:pPr>
+      <w:r>
+        <w:rPr>
+          <w:color w:val="0070C0"/>
+          <w:sz w:val="24"/>
+          <w:rtl/>
+        </w:rPr>
+        <w:t xml:space="preserve">כדי להתמודד עם מגבלת זמן במקום מגבלת עומק, נריץ את </w:t>
+      </w:r>
+      <w:r>
+        <w:rPr>
+          <w:color w:val="0070C0"/>
+          <w:sz w:val="24"/>
+        </w:rPr>
+        <w:t>m</w:t>
+      </w:r>
+      <w:r>
+        <w:rPr>
+          <w:color w:val="0070C0"/>
+          <w:sz w:val="24"/>
+        </w:rPr>
+        <w:t>inimax</w:t>
+      </w:r>
+      <w:r>
+        <w:rPr>
+          <w:color w:val="0070C0"/>
+          <w:sz w:val="24"/>
+          <w:rtl/>
+        </w:rPr>
+        <w:t xml:space="preserve"> בעזרת</w:t>
+      </w:r>
+      <w:r>
+        <w:rPr>
+          <w:color w:val="0070C0"/>
+          <w:sz w:val="24"/>
+        </w:rPr>
+        <w:t>iterative deepening</w:t>
+      </w:r>
+      <w:r>
+        <w:rPr>
+          <w:color w:val="0070C0"/>
+          <w:sz w:val="24"/>
+          <w:rtl/>
+        </w:rPr>
+        <w:t xml:space="preserve">: נתחיל מחיפוש לעומק 1, אחר כך לעומק 2 וכן הלאה, ובכל שלב נשמור את הפעולה הטובה ביותר מהעומק האחרון שהסתיים בזמן. במהלך הריצה </w:t>
+      </w:r>
+      <w:r>
+        <w:rPr>
+          <w:rFonts w:hint="cs"/>
+          <w:color w:val="0070C0"/>
+          <w:sz w:val="24"/>
+          <w:rtl/>
+        </w:rPr>
+        <w:t>כאשר הזמן</w:t>
+      </w:r>
+      <w:r>
+        <w:rPr>
+          <w:color w:val="0070C0"/>
+          <w:sz w:val="24"/>
+          <w:rtl/>
+        </w:rPr>
+        <w:t xml:space="preserve"> שהוקצה נגמר, נעצור ונחזיר את הפתרון הטוב ביותר שנמצא עד כה</w:t>
+      </w:r>
+      <w:r>
+        <w:rPr>
+          <w:rFonts w:hint="cs"/>
+          <w:color w:val="0070C0"/>
+          <w:sz w:val="24"/>
+          <w:rtl/>
+        </w:rPr>
+        <w:t xml:space="preserve"> (בריצה שהסתיימה), גם אם עצרנו באמצע ריצה נוספת</w:t>
+      </w:r>
+      <w:r>
+        <w:rPr>
+          <w:color w:val="0070C0"/>
+          <w:sz w:val="24"/>
+          <w:rtl/>
+        </w:rPr>
+        <w:t xml:space="preserve">. השם הכללי לאלגוריתמים שיכולים לשפר את </w:t>
+      </w:r>
+      <w:r>
+        <w:rPr>
+          <w:rFonts w:hint="cs"/>
+          <w:color w:val="0070C0"/>
+          <w:sz w:val="24"/>
+          <w:rtl/>
+        </w:rPr>
+        <w:t>הביצועים</w:t>
+      </w:r>
+      <w:r>
+        <w:rPr>
+          <w:color w:val="0070C0"/>
+          <w:sz w:val="24"/>
+          <w:rtl/>
+        </w:rPr>
+        <w:t xml:space="preserve"> ככל שיש להם יותר זמן הוא </w:t>
+      </w:r>
+      <w:r>
+        <w:rPr>
+          <w:color w:val="0070C0"/>
+          <w:sz w:val="24"/>
+        </w:rPr>
+        <w:t>a</w:t>
+      </w:r>
+      <w:r>
+        <w:rPr>
+          <w:color w:val="0070C0"/>
+          <w:sz w:val="24"/>
+        </w:rPr>
+        <w:t xml:space="preserve">nytime </w:t>
+      </w:r>
+      <w:r>
+        <w:rPr>
+          <w:color w:val="0070C0"/>
+          <w:sz w:val="24"/>
+        </w:rPr>
+        <w:t>a</w:t>
+      </w:r>
+      <w:r>
+        <w:rPr>
+          <w:color w:val="0070C0"/>
+          <w:sz w:val="24"/>
+        </w:rPr>
+        <w:t>lgorithms</w:t>
+      </w:r>
+      <w:r>
+        <w:rPr>
+          <w:color w:val="0070C0"/>
+          <w:sz w:val="24"/>
+          <w:rtl/>
+        </w:rPr>
+        <w:t>.</w:t>
+      </w:r>
+    </w:p>
+    <w:p>
+      <w:pPr>
+        <w:pStyle w:val="ListParagraph"/>
+        <w:spacing w:after="426" w:line="291" w:lineRule="auto"/>
+        <w:ind w:right="244"/>
+        <w:jc w:val="left"/>
+        <w:rPr>
           <w:rFonts w:asciiTheme="minorBidi" w:hAnsiTheme="minorBidi" w:cstheme="minorBidi"/>
           <w:color w:val="4C94D8" w:themeColor="text2" w:themeTint="80"/>
           <w:sz w:val="24"/>
@@ -8292,6 +8791,7 @@
           <w:rFonts w:asciiTheme="minorBidi" w:hAnsiTheme="minorBidi" w:cstheme="minorBidi"/>
           <w:sz w:val="24"/>
         </w:rPr>
+        <w:lastRenderedPageBreak/>
         <w:t>minimax_decision(env, robot_id, depth, heuristic_fn=None)</w:t>
       </w:r>
     </w:p>
@@ -16265,7 +16765,7 @@
         <w:spacing w:after="0" w:line="360" w:lineRule="auto"/>
         <w:jc w:val="left"/>
         <w:rPr>
-          <w:rFonts w:eastAsia="David" w:hint="cs"/>
+          <w:rFonts w:eastAsia="David"/>
           <w:color w:val="auto"/>
           <w:kern w:val="0"/>
           <w:sz w:val="24"/>

</xml_diff>

<commit_message>
fixes for the heuristic
</commit_message>
<xml_diff>
--- a/HW2_IntroToAI.docx
+++ b/HW2_IntroToAI.docx
@@ -5255,7 +5255,6 @@
           <w:rtl/>
         </w:rPr>
       </w:pPr>
-      <w:proofErr w:type="gramStart"/>
       <w:r>
         <w:rPr>
           <w:rFonts w:asciiTheme="majorHAnsi" w:eastAsia="Assistant" w:hAnsiTheme="majorHAnsi" w:cstheme="minorBidi"/>
@@ -5273,18 +5272,7 @@
           <w:szCs w:val="26"/>
           <w:rtl/>
         </w:rPr>
-        <w:t xml:space="preserve">  -</w:t>
-      </w:r>
-      <w:proofErr w:type="gramEnd"/>
-      <w:r>
-        <w:rPr>
-          <w:rFonts w:asciiTheme="majorHAnsi" w:eastAsia="Assistant" w:hAnsiTheme="majorHAnsi" w:cstheme="minorBidi" w:hint="cs"/>
-          <w:color w:val="0070C0"/>
-          <w:sz w:val="26"/>
-          <w:szCs w:val="26"/>
-          <w:rtl/>
-        </w:rPr>
-        <w:t xml:space="preserve"> סט של כל המצבים החוקיים במשחק, כולל מיקומי רובוטים, בטריות, תחנת טעינה, נקודות של כל רובוט, חבילה נוכחית לכל רובוט (אם יש), חבילות פעילות על הלוח והמיקום שלהן, היעד שלהן, חבילות עתידיות והמיקום שלהן, היעד שלהן. צעדים נותרים, תור נוכחי.</w:t>
+        <w:t xml:space="preserve">  - סט של כל המצבים החוקיים במשחק, כולל מיקומי רובוטים, בטריות, תחנת טעינה, נקודות של כל רובוט, חבילה נוכחית לכל רובוט (אם יש), חבילות פעילות על הלוח והמיקום שלהן, היעד שלהן, חבילות עתידיות והמיקום שלהן, היעד שלהן. צעדים נותרים, תור נוכחי.</w:t>
       </w:r>
     </w:p>
     <w:p>
@@ -5688,7 +5676,7 @@
               <w:rFonts w:ascii="Cambria Math" w:hAnsi="Cambria Math"/>
               <w:color w:val="0070C0"/>
             </w:rPr>
-            <m:t>h(s,r)=0.5⋅ScoreDiff(s,r)+3⋅PackageUtility(s,r)-4⋅EnergyRisk(s,r)</m:t>
+            <m:t>h(s,r)=2⋅ScoreDiff(s,r)+3⋅PackageUtility(s,r)-4⋅EnergyRisk(s,r)</m:t>
           </m:r>
         </m:oMath>
       </m:oMathPara>
@@ -7162,7 +7150,21 @@
               <w:rFonts w:ascii="Cambria Math" w:hAnsi="Cambria Math"/>
               <w:color w:val="0070C0"/>
             </w:rPr>
-            <m:t>EnergyRisk(s,r)=BatteryShortage(s,r)+0.5⋅ChargePenalty(s,r)</m:t>
+            <m:t>EnergyRisk(s,r)=BatteryShortage(s,r)+</m:t>
+          </m:r>
+          <m:r>
+            <w:rPr>
+              <w:rFonts w:ascii="Cambria Math" w:hAnsi="Cambria Math"/>
+              <w:color w:val="0070C0"/>
+            </w:rPr>
+            <m:t>1.5</m:t>
+          </m:r>
+          <m:r>
+            <w:rPr>
+              <w:rFonts w:ascii="Cambria Math" w:hAnsi="Cambria Math"/>
+              <w:color w:val="0070C0"/>
+            </w:rPr>
+            <m:t>⋅ChargePenalty(s,r)</m:t>
           </m:r>
         </m:oMath>
       </m:oMathPara>
@@ -9415,15 +9417,7 @@
           <w:rFonts w:asciiTheme="minorBidi" w:hAnsiTheme="minorBidi" w:cstheme="minorBidi"/>
           <w:sz w:val="24"/>
         </w:rPr>
-        <w:t>alphabeta_</w:t>
-      </w:r>
-      <w:proofErr w:type="gramStart"/>
-      <w:r>
-        <w:rPr>
-          <w:rFonts w:asciiTheme="minorBidi" w:hAnsiTheme="minorBidi" w:cstheme="minorBidi"/>
-          <w:sz w:val="24"/>
-        </w:rPr>
-        <w:t>decision</w:t>
+        <w:t>alphabeta_decision</w:t>
       </w:r>
       <w:proofErr w:type="spellEnd"/>
       <w:r>
@@ -9431,15 +9425,7 @@
           <w:rFonts w:asciiTheme="minorBidi" w:hAnsiTheme="minorBidi" w:cstheme="minorBidi"/>
           <w:sz w:val="24"/>
         </w:rPr>
-        <w:t>(</w:t>
-      </w:r>
-      <w:proofErr w:type="gramEnd"/>
-      <w:r>
-        <w:rPr>
-          <w:rFonts w:asciiTheme="minorBidi" w:hAnsiTheme="minorBidi" w:cstheme="minorBidi"/>
-          <w:sz w:val="24"/>
-        </w:rPr>
-        <w:t xml:space="preserve">env, </w:t>
+        <w:t xml:space="preserve">(env, </w:t>
       </w:r>
       <w:proofErr w:type="spellStart"/>
       <w:r>
@@ -21301,6 +21287,7 @@
   <w:style w:type="character" w:default="1" w:styleId="DefaultParagraphFont">
     <w:name w:val="Default Paragraph Font"/>
     <w:uiPriority w:val="1"/>
+    <w:semiHidden/>
     <w:unhideWhenUsed/>
   </w:style>
   <w:style w:type="table" w:default="1" w:styleId="TableNormal">

</xml_diff>

<commit_message>
fixes for ordereed_operatiors function and implementing alphabeta
</commit_message>
<xml_diff>
--- a/HW2_IntroToAI.docx
+++ b/HW2_IntroToAI.docx
@@ -5255,6 +5255,7 @@
           <w:rtl/>
         </w:rPr>
       </w:pPr>
+      <w:proofErr w:type="gramStart"/>
       <w:r>
         <w:rPr>
           <w:rFonts w:asciiTheme="majorHAnsi" w:eastAsia="Assistant" w:hAnsiTheme="majorHAnsi" w:cstheme="minorBidi"/>
@@ -5272,7 +5273,18 @@
           <w:szCs w:val="26"/>
           <w:rtl/>
         </w:rPr>
-        <w:t xml:space="preserve">  - סט של כל המצבים החוקיים במשחק, כולל מיקומי רובוטים, בטריות, תחנת טעינה, נקודות של כל רובוט, חבילה נוכחית לכל רובוט (אם יש), חבילות פעילות על הלוח והמיקום שלהן, היעד שלהן, חבילות עתידיות והמיקום שלהן, היעד שלהן. צעדים נותרים, תור נוכחי.</w:t>
+        <w:t xml:space="preserve">  -</w:t>
+      </w:r>
+      <w:proofErr w:type="gramEnd"/>
+      <w:r>
+        <w:rPr>
+          <w:rFonts w:asciiTheme="majorHAnsi" w:eastAsia="Assistant" w:hAnsiTheme="majorHAnsi" w:cstheme="minorBidi" w:hint="cs"/>
+          <w:color w:val="0070C0"/>
+          <w:sz w:val="26"/>
+          <w:szCs w:val="26"/>
+          <w:rtl/>
+        </w:rPr>
+        <w:t xml:space="preserve"> סט של כל המצבים החוקיים במשחק, כולל מיקומי רובוטים, בטריות, תחנת טעינה, נקודות של כל רובוט, חבילה נוכחית לכל רובוט (אם יש), חבילות פעילות על הלוח והמיקום שלהן, היעד שלהן, חבילות עתידיות והמיקום שלהן, היעד שלהן. צעדים נותרים, תור נוכחי.</w:t>
       </w:r>
     </w:p>
     <w:p>
@@ -5676,35 +5688,7 @@
               <w:rFonts w:ascii="Cambria Math" w:hAnsi="Cambria Math"/>
               <w:color w:val="0070C0"/>
             </w:rPr>
-            <m:t>h(s,r)=ScoreDiff(s,r)+</m:t>
-          </m:r>
-          <m:r>
-            <w:rPr>
-              <w:rFonts w:ascii="Cambria Math" w:hAnsi="Cambria Math"/>
-              <w:color w:val="0070C0"/>
-            </w:rPr>
-            <m:t>1.5</m:t>
-          </m:r>
-          <m:r>
-            <w:rPr>
-              <w:rFonts w:ascii="Cambria Math" w:hAnsi="Cambria Math"/>
-              <w:color w:val="0070C0"/>
-            </w:rPr>
-            <m:t>⋅PackageUtility(s,r)-</m:t>
-          </m:r>
-          <m:r>
-            <w:rPr>
-              <w:rFonts w:ascii="Cambria Math" w:hAnsi="Cambria Math"/>
-              <w:color w:val="0070C0"/>
-            </w:rPr>
-            <m:t>2</m:t>
-          </m:r>
-          <m:r>
-            <w:rPr>
-              <w:rFonts w:ascii="Cambria Math" w:hAnsi="Cambria Math"/>
-              <w:color w:val="0070C0"/>
-            </w:rPr>
-            <m:t>⋅EnergyRisk(s,r)</m:t>
+            <m:t>h(s,r)=ScoreDiff(s,r)+1.5⋅PackageUtility(s,r)-2⋅EnergyRisk(s,r)</m:t>
           </m:r>
         </m:oMath>
       </m:oMathPara>
@@ -8324,7 +8308,24 @@
           <w:sz w:val="24"/>
           <w:rtl/>
         </w:rPr>
-        <w:t>, אם קיים מהלך שמוביל לניצחון בצעד אחד והמצב הזה נבדק, הסוכן חייב לבחור בו</w:t>
+        <w:t xml:space="preserve">, אם קיים מהלך שמוביל לניצחון בצעד אחד והמצב הזה נבדק, הסוכן </w:t>
+      </w:r>
+      <w:r>
+        <w:rPr>
+          <w:rFonts w:hint="cs"/>
+          <w:color w:val="0070C0"/>
+          <w:sz w:val="24"/>
+          <w:rtl/>
+        </w:rPr>
+        <w:t>יבחר</w:t>
+      </w:r>
+      <w:r>
+        <w:rPr>
+          <w:color w:val="0070C0"/>
+          <w:sz w:val="24"/>
+          <w:rtl/>
+        </w:rPr>
+        <w:t xml:space="preserve"> בו</w:t>
       </w:r>
       <w:r>
         <w:rPr>
@@ -8341,7 +8342,137 @@
           <w:sz w:val="24"/>
           <w:rtl/>
         </w:rPr>
-        <w:t xml:space="preserve"> אחרת יש באג. אבל ב</w:t>
+        <w:t xml:space="preserve"> </w:t>
+      </w:r>
+      <w:r>
+        <w:rPr>
+          <w:rFonts w:hint="cs"/>
+          <w:color w:val="0070C0"/>
+          <w:sz w:val="24"/>
+          <w:rtl/>
+        </w:rPr>
+        <w:t xml:space="preserve">אלא אם יש </w:t>
+      </w:r>
+      <w:r>
+        <w:rPr>
+          <w:rFonts w:hint="cs"/>
+          <w:color w:val="0070C0"/>
+          <w:sz w:val="24"/>
+          <w:rtl/>
+        </w:rPr>
+        <w:t xml:space="preserve">סדרת מהלכים </w:t>
+      </w:r>
+      <w:r>
+        <w:rPr>
+          <w:rFonts w:hint="cs"/>
+          <w:color w:val="0070C0"/>
+          <w:sz w:val="24"/>
+          <w:rtl/>
+        </w:rPr>
+        <w:t>אחרת שמובילה</w:t>
+      </w:r>
+      <w:r>
+        <w:rPr>
+          <w:rFonts w:hint="cs"/>
+          <w:color w:val="0070C0"/>
+          <w:sz w:val="24"/>
+          <w:rtl/>
+        </w:rPr>
+        <w:t xml:space="preserve"> לנצח </w:t>
+      </w:r>
+      <w:r>
+        <w:rPr>
+          <w:color w:val="0070C0"/>
+          <w:sz w:val="24"/>
+          <w:rtl/>
+        </w:rPr>
+        <w:t>–</w:t>
+      </w:r>
+      <w:r>
+        <w:rPr>
+          <w:rFonts w:hint="cs"/>
+          <w:color w:val="0070C0"/>
+          <w:sz w:val="24"/>
+          <w:rtl/>
+        </w:rPr>
+        <w:t xml:space="preserve"> שמחזירה את אותו ערך</w:t>
+      </w:r>
+      <w:r>
+        <w:rPr>
+          <w:rFonts w:hint="cs"/>
+          <w:color w:val="0070C0"/>
+          <w:sz w:val="24"/>
+          <w:rtl/>
+        </w:rPr>
+        <w:t xml:space="preserve"> </w:t>
+      </w:r>
+      <w:r>
+        <w:rPr>
+          <w:color w:val="0070C0"/>
+          <w:sz w:val="24"/>
+        </w:rPr>
+        <w:t>utility</w:t>
+      </w:r>
+      <w:r>
+        <w:rPr>
+          <w:rFonts w:hint="cs"/>
+          <w:color w:val="0070C0"/>
+          <w:sz w:val="24"/>
+          <w:rtl/>
+        </w:rPr>
+        <w:t xml:space="preserve">, </w:t>
+      </w:r>
+      <w:r>
+        <w:rPr>
+          <w:rFonts w:hint="cs"/>
+          <w:color w:val="0070C0"/>
+          <w:sz w:val="24"/>
+          <w:rtl/>
+        </w:rPr>
+        <w:t xml:space="preserve">או ערך גבוה יותר, </w:t>
+      </w:r>
+      <w:r>
+        <w:rPr>
+          <w:rFonts w:hint="cs"/>
+          <w:color w:val="0070C0"/>
+          <w:sz w:val="24"/>
+          <w:rtl/>
+        </w:rPr>
+        <w:t xml:space="preserve">ואז </w:t>
+      </w:r>
+      <w:r>
+        <w:rPr>
+          <w:rFonts w:hint="cs"/>
+          <w:color w:val="0070C0"/>
+          <w:sz w:val="24"/>
+          <w:rtl/>
+        </w:rPr>
+        <w:t>יכול להיות שהאלגוריתם יבחר בהם</w:t>
+      </w:r>
+      <w:r>
+        <w:rPr>
+          <w:color w:val="0070C0"/>
+          <w:sz w:val="24"/>
+          <w:rtl/>
+        </w:rPr>
+        <w:t xml:space="preserve">. </w:t>
+      </w:r>
+      <w:r>
+        <w:rPr>
+          <w:rFonts w:hint="cs"/>
+          <w:color w:val="0070C0"/>
+          <w:sz w:val="24"/>
+          <w:rtl/>
+        </w:rPr>
+        <w:t>אם מדובר</w:t>
+      </w:r>
+      <w:r>
+        <w:rPr>
+          <w:color w:val="0070C0"/>
+          <w:sz w:val="24"/>
+          <w:rtl/>
+        </w:rPr>
+        <w:t xml:space="preserve"> ב</w:t>
       </w:r>
       <w:r>
         <w:rPr>
@@ -8357,15 +8488,29 @@
           <w:color w:val="0070C0"/>
           <w:sz w:val="24"/>
         </w:rPr>
-        <w:t>RB-Minimax</w:t>
-      </w:r>
-      <w:r>
-        <w:rPr>
-          <w:color w:val="0070C0"/>
-          <w:sz w:val="24"/>
-          <w:rtl/>
-        </w:rPr>
-        <w:t xml:space="preserve"> לא בהכרח מדובר בבאג באלגוריתם: האלגוריתם משתמש בפונקציית הערכה </w:t>
+        <w:t>RB-</w:t>
+      </w:r>
+      <w:r>
+        <w:rPr>
+          <w:color w:val="0070C0"/>
+          <w:sz w:val="24"/>
+        </w:rPr>
+        <w:t>m</w:t>
+      </w:r>
+      <w:r>
+        <w:rPr>
+          <w:color w:val="0070C0"/>
+          <w:sz w:val="24"/>
+        </w:rPr>
+        <w:t>inimax</w:t>
+      </w:r>
+      <w:r>
+        <w:rPr>
+          <w:color w:val="0070C0"/>
+          <w:sz w:val="24"/>
+          <w:rtl/>
+        </w:rPr>
+        <w:t xml:space="preserve">: האלגוריתם משתמש בפונקציית הערכה </w:t>
       </w:r>
       <w:r>
         <w:rPr>
@@ -8412,24 +8557,7 @@
           <w:sz w:val="24"/>
           <w:rtl/>
         </w:rPr>
-        <w:t xml:space="preserve"> מספיק, ייתכן שמהלך אחר יקבל ערך גבוה יותר. לכן צריך לוודא שמצבי ניצחון מקבלים ערך גבוה יותר מכל ערך היוריסטי של מצב לא</w:t>
-      </w:r>
-      <w:r>
-        <w:rPr>
-          <w:rFonts w:hint="cs"/>
-          <w:color w:val="0070C0"/>
-          <w:sz w:val="24"/>
-          <w:rtl/>
-        </w:rPr>
-        <w:t xml:space="preserve"> </w:t>
-      </w:r>
-      <w:r>
-        <w:rPr>
-          <w:color w:val="0070C0"/>
-          <w:sz w:val="24"/>
-          <w:rtl/>
-        </w:rPr>
-        <w:t>סופי.</w:t>
+        <w:t xml:space="preserve"> מספיק, ייתכן שמהלך אחר יקבל ערך גבוה יותר. </w:t>
       </w:r>
     </w:p>
     <w:p>
@@ -8808,7 +8936,23 @@
           <w:sz w:val="24"/>
         </w:rPr>
         <w:lastRenderedPageBreak/>
-        <w:t>minimax_decision(env, robot_id, depth, heuristic_fn=None)</w:t>
+        <w:t>minimax_</w:t>
+      </w:r>
+      <w:proofErr w:type="gramStart"/>
+      <w:r>
+        <w:rPr>
+          <w:rFonts w:asciiTheme="minorBidi" w:hAnsiTheme="minorBidi" w:cstheme="minorBidi"/>
+          <w:sz w:val="24"/>
+        </w:rPr>
+        <w:t>decision(</w:t>
+      </w:r>
+      <w:proofErr w:type="gramEnd"/>
+      <w:r>
+        <w:rPr>
+          <w:rFonts w:asciiTheme="minorBidi" w:hAnsiTheme="minorBidi" w:cstheme="minorBidi"/>
+          <w:sz w:val="24"/>
+        </w:rPr>
+        <w:t>env, robot_id, depth, heuristic_fn=None)</w:t>
       </w:r>
     </w:p>
     <w:p>
@@ -9431,7 +9575,15 @@
           <w:rFonts w:asciiTheme="minorBidi" w:hAnsiTheme="minorBidi" w:cstheme="minorBidi"/>
           <w:sz w:val="24"/>
         </w:rPr>
-        <w:t>alphabeta_decision</w:t>
+        <w:t>alphabeta_</w:t>
+      </w:r>
+      <w:proofErr w:type="gramStart"/>
+      <w:r>
+        <w:rPr>
+          <w:rFonts w:asciiTheme="minorBidi" w:hAnsiTheme="minorBidi" w:cstheme="minorBidi"/>
+          <w:sz w:val="24"/>
+        </w:rPr>
+        <w:t>decision</w:t>
       </w:r>
       <w:proofErr w:type="spellEnd"/>
       <w:r>
@@ -9439,7 +9591,15 @@
           <w:rFonts w:asciiTheme="minorBidi" w:hAnsiTheme="minorBidi" w:cstheme="minorBidi"/>
           <w:sz w:val="24"/>
         </w:rPr>
-        <w:t xml:space="preserve">(env, </w:t>
+        <w:t>(</w:t>
+      </w:r>
+      <w:proofErr w:type="gramEnd"/>
+      <w:r>
+        <w:rPr>
+          <w:rFonts w:asciiTheme="minorBidi" w:hAnsiTheme="minorBidi" w:cstheme="minorBidi"/>
+          <w:sz w:val="24"/>
+        </w:rPr>
+        <w:t xml:space="preserve">env, </w:t>
       </w:r>
       <w:proofErr w:type="spellStart"/>
       <w:r>
@@ -9616,6 +9776,351 @@
     </w:p>
     <w:p>
       <w:pPr>
+        <w:spacing w:after="10" w:line="291" w:lineRule="auto"/>
+        <w:ind w:left="785" w:right="519"/>
+        <w:jc w:val="left"/>
+        <w:rPr>
+          <w:color w:val="0070C0"/>
+          <w:sz w:val="20"/>
+          <w:szCs w:val="22"/>
+          <w:rtl/>
+        </w:rPr>
+      </w:pPr>
+      <w:r>
+        <w:rPr>
+          <w:color w:val="0070C0"/>
+          <w:sz w:val="20"/>
+          <w:szCs w:val="22"/>
+          <w:rtl/>
+        </w:rPr>
+        <w:t xml:space="preserve">עבור אותו עומק חיפוש, אותה יוריסטיקה ואותו כלל שבירת שוויון, סוכן </w:t>
+      </w:r>
+      <w:r>
+        <w:rPr>
+          <w:color w:val="0070C0"/>
+          <w:sz w:val="20"/>
+          <w:szCs w:val="22"/>
+        </w:rPr>
+        <w:t>a</w:t>
+      </w:r>
+      <w:r>
+        <w:rPr>
+          <w:color w:val="0070C0"/>
+          <w:sz w:val="20"/>
+          <w:szCs w:val="22"/>
+        </w:rPr>
+        <w:t>lpha</w:t>
+      </w:r>
+      <w:r>
+        <w:rPr>
+          <w:color w:val="0070C0"/>
+          <w:sz w:val="20"/>
+          <w:szCs w:val="22"/>
+        </w:rPr>
+        <w:t xml:space="preserve"> b</w:t>
+      </w:r>
+      <w:r>
+        <w:rPr>
+          <w:color w:val="0070C0"/>
+          <w:sz w:val="20"/>
+          <w:szCs w:val="22"/>
+        </w:rPr>
+        <w:t>eta</w:t>
+      </w:r>
+      <w:r>
+        <w:rPr>
+          <w:color w:val="0070C0"/>
+          <w:sz w:val="20"/>
+          <w:szCs w:val="22"/>
+          <w:rtl/>
+        </w:rPr>
+        <w:t xml:space="preserve"> אמור לבחור את אותו מהלך כמו סוכן </w:t>
+      </w:r>
+      <w:r>
+        <w:rPr>
+          <w:color w:val="0070C0"/>
+          <w:sz w:val="20"/>
+          <w:szCs w:val="22"/>
+        </w:rPr>
+        <w:t>m</w:t>
+      </w:r>
+      <w:r>
+        <w:rPr>
+          <w:color w:val="0070C0"/>
+          <w:sz w:val="20"/>
+          <w:szCs w:val="22"/>
+        </w:rPr>
+        <w:t>inimax</w:t>
+      </w:r>
+      <w:r>
+        <w:rPr>
+          <w:color w:val="0070C0"/>
+          <w:sz w:val="20"/>
+          <w:szCs w:val="22"/>
+          <w:rtl/>
+        </w:rPr>
+        <w:t xml:space="preserve">, משום שהגיזום לא משנה את ערך המינימקס אלא רק מסיר ענפים שלא </w:t>
+      </w:r>
+      <w:r>
+        <w:rPr>
+          <w:rFonts w:hint="cs"/>
+          <w:color w:val="0070C0"/>
+          <w:sz w:val="20"/>
+          <w:szCs w:val="22"/>
+          <w:rtl/>
+        </w:rPr>
+        <w:t>משפיעים על התוצאה</w:t>
+      </w:r>
+      <w:r>
+        <w:rPr>
+          <w:color w:val="0070C0"/>
+          <w:sz w:val="20"/>
+          <w:szCs w:val="22"/>
+          <w:rtl/>
+        </w:rPr>
+        <w:t>.</w:t>
+      </w:r>
+    </w:p>
+    <w:p>
+      <w:pPr>
+        <w:spacing w:after="10" w:line="291" w:lineRule="auto"/>
+        <w:ind w:left="785" w:right="519"/>
+        <w:jc w:val="left"/>
+        <w:rPr>
+          <w:color w:val="0070C0"/>
+          <w:sz w:val="20"/>
+          <w:szCs w:val="22"/>
+          <w:rtl/>
+        </w:rPr>
+      </w:pPr>
+      <w:r>
+        <w:rPr>
+          <w:color w:val="0070C0"/>
+          <w:sz w:val="20"/>
+          <w:szCs w:val="22"/>
+          <w:rtl/>
+        </w:rPr>
+        <w:t xml:space="preserve">ההבדל הוא בזמן ריצה: </w:t>
+      </w:r>
+      <w:r>
+        <w:rPr>
+          <w:color w:val="0070C0"/>
+          <w:sz w:val="20"/>
+          <w:szCs w:val="22"/>
+        </w:rPr>
+        <w:t>a</w:t>
+      </w:r>
+      <w:r>
+        <w:rPr>
+          <w:color w:val="0070C0"/>
+          <w:sz w:val="20"/>
+          <w:szCs w:val="22"/>
+        </w:rPr>
+        <w:t>lpha</w:t>
+      </w:r>
+      <w:r>
+        <w:rPr>
+          <w:color w:val="0070C0"/>
+          <w:sz w:val="20"/>
+          <w:szCs w:val="22"/>
+        </w:rPr>
+        <w:t xml:space="preserve"> b</w:t>
+      </w:r>
+      <w:r>
+        <w:rPr>
+          <w:color w:val="0070C0"/>
+          <w:sz w:val="20"/>
+          <w:szCs w:val="22"/>
+        </w:rPr>
+        <w:t>eta</w:t>
+      </w:r>
+      <w:r>
+        <w:rPr>
+          <w:color w:val="0070C0"/>
+          <w:sz w:val="20"/>
+          <w:szCs w:val="22"/>
+          <w:rtl/>
+        </w:rPr>
+        <w:t xml:space="preserve"> בדרך כלל יעיל יותר, כי הוא לא צריך לפתח את כל </w:t>
+      </w:r>
+      <w:r>
+        <w:rPr>
+          <w:rFonts w:hint="cs"/>
+          <w:color w:val="0070C0"/>
+          <w:sz w:val="20"/>
+          <w:szCs w:val="22"/>
+          <w:rtl/>
+        </w:rPr>
+        <w:t>ה</w:t>
+      </w:r>
+      <w:r>
+        <w:rPr>
+          <w:color w:val="0070C0"/>
+          <w:sz w:val="20"/>
+          <w:szCs w:val="22"/>
+          <w:rtl/>
+        </w:rPr>
+        <w:t>עץ חיפוש</w:t>
+      </w:r>
+      <w:r>
+        <w:rPr>
+          <w:rFonts w:hint="cs"/>
+          <w:color w:val="0070C0"/>
+          <w:sz w:val="20"/>
+          <w:szCs w:val="22"/>
+          <w:rtl/>
+        </w:rPr>
+        <w:t xml:space="preserve"> כמו </w:t>
+      </w:r>
+      <w:r>
+        <w:rPr>
+          <w:color w:val="0070C0"/>
+          <w:sz w:val="20"/>
+          <w:szCs w:val="22"/>
+        </w:rPr>
+        <w:t>minimax</w:t>
+      </w:r>
+      <w:r>
+        <w:rPr>
+          <w:color w:val="0070C0"/>
+          <w:sz w:val="20"/>
+          <w:szCs w:val="22"/>
+          <w:rtl/>
+        </w:rPr>
+        <w:t xml:space="preserve">. במקרה הגרוע זמן הריצה יכול להיות דומה, אך במקרה טוב הוא בודק פחות מצבים ולכן יכול להספיק להגיע לעומק </w:t>
+      </w:r>
+      <w:r>
+        <w:rPr>
+          <w:rFonts w:hint="cs"/>
+          <w:color w:val="0070C0"/>
+          <w:sz w:val="20"/>
+          <w:szCs w:val="22"/>
+          <w:rtl/>
+        </w:rPr>
+        <w:t>עמוק</w:t>
+      </w:r>
+      <w:r>
+        <w:rPr>
+          <w:color w:val="0070C0"/>
+          <w:sz w:val="20"/>
+          <w:szCs w:val="22"/>
+          <w:rtl/>
+        </w:rPr>
+        <w:t xml:space="preserve"> יותר.</w:t>
+      </w:r>
+    </w:p>
+    <w:p>
+      <w:pPr>
+        <w:spacing w:after="10" w:line="291" w:lineRule="auto"/>
+        <w:ind w:left="785" w:right="519"/>
+        <w:jc w:val="left"/>
+        <w:rPr>
+          <w:color w:val="0070C0"/>
+          <w:sz w:val="20"/>
+          <w:szCs w:val="22"/>
+        </w:rPr>
+      </w:pPr>
+      <w:r>
+        <w:rPr>
+          <w:color w:val="0070C0"/>
+          <w:sz w:val="20"/>
+          <w:szCs w:val="22"/>
+          <w:rtl/>
+        </w:rPr>
+        <w:t xml:space="preserve">לכן, בעומק קבוע בחירת המהלך אמורה להיות זהה, אך זמן הריצה של </w:t>
+      </w:r>
+      <w:r>
+        <w:rPr>
+          <w:rFonts w:hint="cs"/>
+          <w:color w:val="0070C0"/>
+          <w:sz w:val="20"/>
+          <w:szCs w:val="22"/>
+          <w:rtl/>
+        </w:rPr>
+        <w:t>אלפא בטא</w:t>
+      </w:r>
+      <w:r>
+        <w:rPr>
+          <w:color w:val="0070C0"/>
+          <w:sz w:val="20"/>
+          <w:szCs w:val="22"/>
+          <w:rtl/>
+        </w:rPr>
+        <w:t xml:space="preserve"> לרוב יהיה </w:t>
+      </w:r>
+      <w:r>
+        <w:rPr>
+          <w:rFonts w:hint="cs"/>
+          <w:color w:val="0070C0"/>
+          <w:sz w:val="20"/>
+          <w:szCs w:val="22"/>
+          <w:rtl/>
+        </w:rPr>
+        <w:t>קצר יותר</w:t>
+      </w:r>
+      <w:r>
+        <w:rPr>
+          <w:color w:val="0070C0"/>
+          <w:sz w:val="20"/>
+          <w:szCs w:val="22"/>
+          <w:rtl/>
+        </w:rPr>
+        <w:t xml:space="preserve">. כאשר הסוכן מוגבל בזמן, ייתכן שבפועל הוא יבחר מהלך שונה, כי הוא עשוי להספיק לחפש עמוק יותר </w:t>
+      </w:r>
+      <w:r>
+        <w:rPr>
+          <w:rFonts w:hint="cs"/>
+          <w:color w:val="0070C0"/>
+          <w:sz w:val="20"/>
+          <w:szCs w:val="22"/>
+          <w:rtl/>
+        </w:rPr>
+        <w:t xml:space="preserve">תחת אותו </w:t>
+      </w:r>
+      <w:proofErr w:type="spellStart"/>
+      <w:r>
+        <w:rPr>
+          <w:color w:val="0070C0"/>
+          <w:sz w:val="20"/>
+          <w:szCs w:val="22"/>
+        </w:rPr>
+        <w:t>time_limit</w:t>
+      </w:r>
+      <w:proofErr w:type="spellEnd"/>
+      <w:r>
+        <w:rPr>
+          <w:rFonts w:hint="cs"/>
+          <w:color w:val="0070C0"/>
+          <w:sz w:val="20"/>
+          <w:szCs w:val="22"/>
+          <w:rtl/>
+        </w:rPr>
+        <w:t xml:space="preserve"> </w:t>
+      </w:r>
+      <w:r>
+        <w:rPr>
+          <w:color w:val="0070C0"/>
+          <w:sz w:val="20"/>
+          <w:szCs w:val="22"/>
+          <w:rtl/>
+        </w:rPr>
+        <w:t>.</w:t>
+      </w:r>
+    </w:p>
+    <w:p>
+      <w:pPr>
+        <w:spacing w:after="10" w:line="291" w:lineRule="auto"/>
+        <w:ind w:left="785" w:right="519"/>
+        <w:jc w:val="left"/>
+        <w:rPr>
+          <w:color w:val="0070C0"/>
+          <w:sz w:val="20"/>
+          <w:szCs w:val="22"/>
+        </w:rPr>
+      </w:pPr>
+    </w:p>
+    <w:p>
+      <w:pPr>
         <w:numPr>
           <w:ilvl w:val="0"/>
           <w:numId w:val="25"/>
@@ -9799,8 +10304,35 @@
           <w:sz w:val="24"/>
           <w:rtl/>
         </w:rPr>
-        <w:t xml:space="preserve"> שעבורם העץ ייגזם:_________</w:t>
-      </w:r>
+        <w:t xml:space="preserve"> שעבורם העץ ייגזם:</w:t>
+      </w:r>
+      <w:r>
+        <w:rPr>
+          <w:rFonts w:hint="cs"/>
+          <w:color w:val="auto"/>
+          <w:sz w:val="24"/>
+          <w:rtl/>
+        </w:rPr>
+        <w:t xml:space="preserve"> </w:t>
+      </w:r>
+      <m:oMath>
+        <m:r>
+          <w:rPr>
+            <w:rFonts w:ascii="Cambria Math" w:hAnsi="Cambria Math"/>
+            <w:color w:val="0070C0"/>
+            <w:sz w:val="24"/>
+          </w:rPr>
+          <m:t>x</m:t>
+        </m:r>
+        <m:r>
+          <w:rPr>
+            <w:rFonts w:ascii="Cambria Math" w:hAnsi="Cambria Math"/>
+            <w:color w:val="0070C0"/>
+            <w:sz w:val="24"/>
+          </w:rPr>
+          <m:t>≤1</m:t>
+        </m:r>
+      </m:oMath>
     </w:p>
     <w:p>
       <w:pPr>
@@ -9815,45 +10347,19 @@
           <w:rtl/>
         </w:rPr>
       </w:pPr>
-    </w:p>
-    <w:p>
-      <w:pPr>
-        <w:spacing w:after="426" w:line="291" w:lineRule="auto"/>
-        <w:ind w:right="351"/>
-        <w:jc w:val="left"/>
+      <w:r>
         <w:rPr>
           <w:strike/>
+          <w:noProof/>
           <w:color w:val="auto"/>
           <w:sz w:val="28"/>
           <w:szCs w:val="28"/>
-        </w:rPr>
-      </w:pPr>
-    </w:p>
-    <w:p>
-      <w:pPr>
-        <w:spacing w:after="426" w:line="291" w:lineRule="auto"/>
-        <w:ind w:right="351"/>
-        <w:jc w:val="left"/>
-        <w:rPr>
-          <w:strike/>
-          <w:color w:val="auto"/>
-          <w:sz w:val="28"/>
-          <w:szCs w:val="28"/>
-        </w:rPr>
-      </w:pPr>
-      <w:r>
-        <w:rPr>
-          <w:strike/>
-          <w:noProof/>
-          <w:color w:val="auto"/>
-          <w:sz w:val="28"/>
-          <w:szCs w:val="28"/>
           <w:rtl/>
         </w:rPr>
         <w:drawing>
-          <wp:inline distT="0" distB="0" distL="0" distR="0" wp14:anchorId="2DD8ED62" wp14:editId="06227E2B">
-            <wp:extent cx="4972151" cy="4325510"/>
-            <wp:effectExtent l="0" t="0" r="0" b="5715"/>
+          <wp:inline distT="0" distB="0" distL="0" distR="0" wp14:anchorId="61335CCB" wp14:editId="2751FB6D">
+            <wp:extent cx="3906683" cy="3398608"/>
+            <wp:effectExtent l="0" t="0" r="0" b="0"/>
             <wp:docPr id="650345091" name="Picture 1"/>
             <wp:cNvGraphicFramePr>
               <a:graphicFrameLocks xmlns:a="http://schemas.openxmlformats.org/drawingml/2006/main" noChangeAspect="1"/>
@@ -9874,7 +10380,7 @@
                   <pic:spPr>
                     <a:xfrm>
                       <a:off x="0" y="0"/>
-                      <a:ext cx="4981346" cy="4333509"/>
+                      <a:ext cx="3933434" cy="3421880"/>
                     </a:xfrm>
                     <a:prstGeom prst="rect">
                       <a:avLst/>
@@ -9889,6 +10395,19 @@
     </w:p>
     <w:p>
       <w:pPr>
+        <w:spacing w:after="426" w:line="291" w:lineRule="auto"/>
+        <w:ind w:right="351"/>
+        <w:jc w:val="left"/>
+        <w:rPr>
+          <w:strike/>
+          <w:color w:val="auto"/>
+          <w:sz w:val="28"/>
+          <w:szCs w:val="28"/>
+        </w:rPr>
+      </w:pPr>
+    </w:p>
+    <w:p>
+      <w:pPr>
         <w:bidi w:val="0"/>
         <w:spacing w:line="278" w:lineRule="auto"/>
         <w:jc w:val="left"/>
@@ -9917,7 +10436,6 @@
           <w:sz w:val="24"/>
           <w:rtl/>
         </w:rPr>
-        <w:lastRenderedPageBreak/>
         <w:t xml:space="preserve">חלק ד' </w:t>
       </w:r>
       <w:r>
@@ -16721,13 +17239,6 @@
         </w:pBdr>
         <w:spacing w:after="0" w:line="360" w:lineRule="auto"/>
         <w:jc w:val="left"/>
-        <w:rPr>
-          <w:rFonts w:eastAsia="David"/>
-          <w:color w:val="auto"/>
-          <w:kern w:val="0"/>
-          <w:sz w:val="24"/>
-          <w14:ligatures w14:val="none"/>
-        </w:rPr>
       </w:pPr>
       <w:r>
         <w:rPr>
@@ -16764,6 +17275,103 @@
         </w:pBdr>
         <w:spacing w:after="0" w:line="360" w:lineRule="auto"/>
         <w:jc w:val="left"/>
+      </w:pPr>
+      <w:r>
+        <w:rPr>
+          <w:rFonts w:hint="cs"/>
+          <w:rtl/>
+        </w:rPr>
+        <w:t xml:space="preserve">חלק ב שאלה 2 - </w:t>
+      </w:r>
+      <w:hyperlink r:id="rId20" w:history="1">
+        <w:r>
+          <w:rPr>
+            <w:rStyle w:val="Hyperlink"/>
+          </w:rPr>
+          <w:t>https://chatgpt.com/share/6a4258eb-3d3c-83eb-976a-528e60c6ce3c</w:t>
+        </w:r>
+      </w:hyperlink>
+    </w:p>
+    <w:p>
+      <w:pPr>
+        <w:pBdr>
+          <w:top w:val="nil"/>
+          <w:left w:val="nil"/>
+          <w:bottom w:val="nil"/>
+          <w:right w:val="nil"/>
+          <w:between w:val="nil"/>
+        </w:pBdr>
+        <w:spacing w:after="0" w:line="360" w:lineRule="auto"/>
+        <w:jc w:val="left"/>
+        <w:rPr>
+          <w:rFonts w:eastAsia="David" w:hint="cs"/>
+          <w:color w:val="auto"/>
+          <w:kern w:val="0"/>
+          <w:sz w:val="24"/>
+          <w:rtl/>
+          <w14:ligatures w14:val="none"/>
+        </w:rPr>
+      </w:pPr>
+      <w:r>
+        <w:rPr>
+          <w:rFonts w:hint="cs"/>
+          <w:rtl/>
+        </w:rPr>
+        <w:t>חלק ב שאלה 4</w:t>
+      </w:r>
+      <w:r>
+        <w:rPr>
+          <w:rFonts w:hint="cs"/>
+          <w:rtl/>
+        </w:rPr>
+        <w:t xml:space="preserve"> </w:t>
+      </w:r>
+      <w:r>
+        <w:rPr>
+          <w:rFonts w:hint="cs"/>
+          <w:rtl/>
+        </w:rPr>
+        <w:t>+ חלק ג שאלה 1</w:t>
+      </w:r>
+      <w:r>
+        <w:rPr>
+          <w:rFonts w:hint="cs"/>
+          <w:rtl/>
+        </w:rPr>
+        <w:t xml:space="preserve"> - </w:t>
+      </w:r>
+      <w:hyperlink r:id="rId21" w:history="1">
+        <w:r>
+          <w:rPr>
+            <w:rStyle w:val="Hyperlink"/>
+          </w:rPr>
+          <w:t>https://chatgpt.com/share/6a42610</w:t>
+        </w:r>
+        <w:r>
+          <w:rPr>
+            <w:rStyle w:val="Hyperlink"/>
+          </w:rPr>
+          <w:t>5</w:t>
+        </w:r>
+        <w:r>
+          <w:rPr>
+            <w:rStyle w:val="Hyperlink"/>
+          </w:rPr>
+          <w:t>-441c-83eb-9dab-6e8a3aed0c85</w:t>
+        </w:r>
+      </w:hyperlink>
+    </w:p>
+    <w:p>
+      <w:pPr>
+        <w:pBdr>
+          <w:top w:val="nil"/>
+          <w:left w:val="nil"/>
+          <w:bottom w:val="nil"/>
+          <w:right w:val="nil"/>
+          <w:between w:val="nil"/>
+        </w:pBdr>
+        <w:spacing w:after="0" w:line="360" w:lineRule="auto"/>
+        <w:jc w:val="left"/>
         <w:rPr>
           <w:rFonts w:eastAsia="David"/>
           <w:color w:val="auto"/>
@@ -16775,9 +17383,9 @@
       </w:pPr>
     </w:p>
     <w:sectPr>
-      <w:headerReference w:type="even" r:id="rId20"/>
-      <w:headerReference w:type="default" r:id="rId21"/>
-      <w:headerReference w:type="first" r:id="rId22"/>
+      <w:headerReference w:type="even" r:id="rId22"/>
+      <w:headerReference w:type="default" r:id="rId23"/>
+      <w:headerReference w:type="first" r:id="rId24"/>
       <w:pgSz w:w="11920" w:h="16840"/>
       <w:pgMar w:top="1440" w:right="1440" w:bottom="1440" w:left="1440" w:header="720" w:footer="720" w:gutter="0"/>
       <w:cols w:space="720"/>
@@ -21301,7 +21909,6 @@
   <w:style w:type="character" w:default="1" w:styleId="DefaultParagraphFont">
     <w:name w:val="Default Paragraph Font"/>
     <w:uiPriority w:val="1"/>
-    <w:semiHidden/>
     <w:unhideWhenUsed/>
   </w:style>
   <w:style w:type="table" w:default="1" w:styleId="TableNormal">
@@ -21539,6 +22146,18 @@
     <w:rPr>
       <w:rFonts w:ascii="Times New Roman" w:hAnsi="Times New Roman" w:cs="Times New Roman"/>
       <w:sz w:val="24"/>
+    </w:rPr>
+  </w:style>
+  <w:style w:type="character" w:styleId="FollowedHyperlink">
+    <w:name w:val="FollowedHyperlink"/>
+    <w:basedOn w:val="DefaultParagraphFont"/>
+    <w:uiPriority w:val="99"/>
+    <w:semiHidden/>
+    <w:unhideWhenUsed/>
+    <w:rsid w:val="00B86CFB"/>
+    <w:rPr>
+      <w:color w:val="96607D" w:themeColor="followedHyperlink"/>
+      <w:u w:val="single"/>
     </w:rPr>
   </w:style>
 </w:styles>

</xml_diff>